<commit_message>
Add author and guide details, repository link, and availability statement
- Full author block: R Vinay Kumar, Department of Advanced Computing,
  St. Joseph's University, with affiliation and contact
- Research guide S. Dutta added with the same affiliation
- New "Data and Code Availability" section before the references, linking
  this repository and noting that the superseded seven-variable ML run is
  retained so the leakage diagnosis can be verified
- README carries the same author and guide details
- Superseded manuscript drafts removed; paper/ holds the single final version

Co-Authored-By: Claude Opus 5 <noreply@anthropic.com>
</commit_message>
<xml_diff>
--- a/paper/Fiscal_Discipline_and_Investment_Outcomes.docx
+++ b/paper/Fiscal_Discipline_and_Investment_Outcomes.docx
@@ -17,26 +17,101 @@
     <w:p>
       <w:pPr>
         <w:jc w:val="center"/>
+        <w:spacing w:after="0"/>
+      </w:pPr>
+      <w:r>
+        <w:rPr>
+          <w:b/>
+          <w:sz w:val="24"/>
+        </w:rPr>
+        <w:t xml:space="preserve">R Vinay Kumar</w:t>
+      </w:r>
+    </w:p>
+    <w:p>
+      <w:pPr>
+        <w:jc w:val="center"/>
+        <w:spacing w:after="0"/>
       </w:pPr>
       <w:r>
         <w:rPr>
           <w:i/>
         </w:rPr>
-        <w:t xml:space="preserve">R VINAY </w:t>
-      </w:r>
-      <w:proofErr w:type="gramStart"/>
+        <w:t xml:space="preserve">Department of Advanced Computing, St. Joseph's University</w:t>
+      </w:r>
+    </w:p>
+    <w:p>
+      <w:pPr>
+        <w:jc w:val="center"/>
+        <w:spacing w:after="0"/>
+      </w:pPr>
       <w:r>
         <w:rPr>
           <w:i/>
         </w:rPr>
-        <w:t>KUMAR ,</w:t>
-      </w:r>
-      <w:proofErr w:type="gramEnd"/>
+        <w:t xml:space="preserve">Bengaluru, Karnataka, India</w:t>
+      </w:r>
+    </w:p>
+    <w:p>
+      <w:pPr>
+        <w:jc w:val="center"/>
+        <w:spacing w:after="0"/>
+      </w:pPr>
+      <w:r>
+        <w:t xml:space="preserve">rvinaykumar6924@gmail.com</w:t>
+      </w:r>
+    </w:p>
+    <w:p>
+      <w:pPr>
+        <w:jc w:val="center"/>
+        <w:spacing w:after="0"/>
+      </w:pPr>
+      <w:r>
+        <w:t xml:space="preserve"> </w:t>
+      </w:r>
+    </w:p>
+    <w:p>
+      <w:pPr>
+        <w:jc w:val="center"/>
+        <w:spacing w:after="0"/>
+      </w:pPr>
+      <w:r>
+        <w:rPr>
+          <w:b/>
+        </w:rPr>
+        <w:t xml:space="preserve">Research Guide: S. Dutta</w:t>
+      </w:r>
+    </w:p>
+    <w:p>
+      <w:pPr>
+        <w:jc w:val="center"/>
+        <w:spacing w:after="0"/>
+      </w:pPr>
       <w:r>
         <w:rPr>
           <w:i/>
         </w:rPr>
-        <w:t xml:space="preserve"> ST. JOSEPH’S UNIVERSITY</w:t>
+        <w:t xml:space="preserve">Department of Advanced Computing, St. Joseph's University</w:t>
+      </w:r>
+    </w:p>
+    <w:p>
+      <w:pPr>
+        <w:jc w:val="center"/>
+        <w:spacing w:after="0"/>
+      </w:pPr>
+      <w:r>
+        <w:rPr>
+          <w:i/>
+        </w:rPr>
+        <w:t xml:space="preserve">Bengaluru, Karnataka, India</w:t>
+      </w:r>
+    </w:p>
+    <w:p>
+      <w:pPr>
+        <w:jc w:val="center"/>
+        <w:spacing w:after="0"/>
+      </w:pPr>
+      <w:r>
+        <w:t xml:space="preserve">duttasanjay098@gmail.com</w:t>
       </w:r>
     </w:p>
     <w:p>
@@ -38403,6 +38478,22 @@
       </w:pPr>
       <w:r>
         <w:t>Three extensions follow from those limits. A longer panel, once further post-pandemic years have been audited, would show whether the within-state debt coefficient moves toward the between-state sign as FY 2020-21 loses weight in the estimation window; Section 7.1 predicts that it should. Adding off-budget guarantees to the debt measure, and interacting capital expenditure with its financing source, are the two specification changes that Section 7.2 and the limitations above point to most directly. Beyond this sample, the natural test of external validity is to extend the panel below the top ten, where the variation in both fiscal position and investment is wider and the agglomeration floor is lower, and to ask whether the same convergence across methods survives outside the group of states that were always going to receive the capital.</w:t>
+      </w:r>
+    </w:p>
+    <w:p>
+      <w:pPr>
+        <w:pStyle w:val="Heading1"/>
+      </w:pPr>
+      <w:r>
+        <w:t>Data and Code Availability</w:t>
+      </w:r>
+    </w:p>
+    <w:p>
+      <w:pPr>
+        <w:jc w:val="both"/>
+      </w:pPr>
+      <w:r>
+        <w:t xml:space="preserve">The complete dataset, analysis code, results and this manuscript are openly available at https://github.com/fbivinay/Fiscal-Discipline-and-Investment-Outcomes. The repository contains the audited source series, the 50-row analysis panel used in every estimate reported here, all five analysis scripts, and the full set of tables and figures, so that each result can be reproduced from the raw inputs. It also retains the superseded seven-variable machine-learning run discussed in Section 5.2, so that the leakage diagnosis reported there can be verified rather than taken on trust.</w:t>
       </w:r>
     </w:p>
     <w:p>

</xml_diff>

<commit_message>
Align Section 7 with the revised inference and correct 7.4
- 7.1: debt significance restated under both cluster-robust and wild
  cluster bootstrap; within-state paragraph rewritten
- 7.2: capital expenditure no longer described as significant, since it
  does not survive the bootstrap (p = 0.094); no claim now rests on it
- 7.3: Jharkhand and Uttar Pradesh paragraphs made specific about which
  estimates move and why
- 7.4: rewritten. The section had cited the urbanisation result as partial
  support for the agglomeration hypothesis, but that result is the state-
  identity leakage artefact disclosed in Section 5.2 and is not evidence
  about clustering in either direction. The heading was also fused into
  the body text and is now a separate Heading 2.

Co-Authored-By: Claude Opus 5 <noreply@anthropic.com>
</commit_message>
<xml_diff>
--- a/paper/Fiscal_Discipline_and_Investment_Outcomes.docx
+++ b/paper/Fiscal_Discipline_and_Investment_Outcomes.docx
@@ -16,54 +16,62 @@
     </w:p>
     <w:p>
       <w:pPr>
+        <w:spacing w:after="0"/>
         <w:jc w:val="center"/>
-        <w:spacing w:after="0"/>
       </w:pPr>
       <w:r>
         <w:rPr>
           <w:b/>
           <w:sz w:val="24"/>
         </w:rPr>
-        <w:t xml:space="preserve">R Vinay Kumar</w:t>
+        <w:t>R Vinay Kumar</w:t>
       </w:r>
     </w:p>
     <w:p>
       <w:pPr>
+        <w:spacing w:after="0"/>
         <w:jc w:val="center"/>
-        <w:spacing w:after="0"/>
       </w:pPr>
       <w:r>
         <w:rPr>
           <w:i/>
         </w:rPr>
-        <w:t xml:space="preserve">Department of Advanced Computing, St. Joseph's University</w:t>
+        <w:t>Department of Advanced Computing, St. Joseph's University</w:t>
       </w:r>
     </w:p>
     <w:p>
       <w:pPr>
+        <w:spacing w:after="0"/>
         <w:jc w:val="center"/>
-        <w:spacing w:after="0"/>
       </w:pPr>
       <w:r>
         <w:rPr>
           <w:i/>
         </w:rPr>
-        <w:t xml:space="preserve">Bengaluru, Karnataka, India</w:t>
+        <w:t>Bengaluru, Karnataka, India</w:t>
       </w:r>
     </w:p>
     <w:p>
       <w:pPr>
+        <w:spacing w:after="0"/>
         <w:jc w:val="center"/>
-        <w:spacing w:after="0"/>
       </w:pPr>
-      <w:r>
-        <w:t xml:space="preserve">rvinaykumar6924@gmail.com</w:t>
+      <w:hyperlink r:id="rId6" w:history="1">
+        <w:r>
+          <w:rPr>
+            <w:rStyle w:val="Hyperlink"/>
+          </w:rPr>
+          <w:t>rvinaykumar6924@gmail.com</w:t>
+        </w:r>
+      </w:hyperlink>
+      <w:r>
+        <w:t xml:space="preserve"> </w:t>
       </w:r>
     </w:p>
     <w:p>
       <w:pPr>
+        <w:spacing w:after="0"/>
         <w:jc w:val="center"/>
-        <w:spacing w:after="0"/>
       </w:pPr>
       <w:r>
         <w:t xml:space="preserve"> </w:t>
@@ -71,47 +79,55 @@
     </w:p>
     <w:p>
       <w:pPr>
+        <w:spacing w:after="0"/>
         <w:jc w:val="center"/>
-        <w:spacing w:after="0"/>
       </w:pPr>
       <w:r>
         <w:rPr>
           <w:b/>
         </w:rPr>
-        <w:t xml:space="preserve">Research Guide: S. Dutta</w:t>
+        <w:t>Research Guide: S. Dutta</w:t>
       </w:r>
     </w:p>
     <w:p>
       <w:pPr>
+        <w:spacing w:after="0"/>
         <w:jc w:val="center"/>
-        <w:spacing w:after="0"/>
       </w:pPr>
       <w:r>
         <w:rPr>
           <w:i/>
         </w:rPr>
-        <w:t xml:space="preserve">Department of Advanced Computing, St. Joseph's University</w:t>
+        <w:t>Department of Advanced Computing, St. Joseph's University</w:t>
       </w:r>
     </w:p>
     <w:p>
       <w:pPr>
+        <w:spacing w:after="0"/>
         <w:jc w:val="center"/>
-        <w:spacing w:after="0"/>
       </w:pPr>
       <w:r>
         <w:rPr>
           <w:i/>
         </w:rPr>
-        <w:t xml:space="preserve">Bengaluru, Karnataka, India</w:t>
+        <w:t>Bengaluru, Karnataka, India</w:t>
       </w:r>
     </w:p>
     <w:p>
       <w:pPr>
+        <w:spacing w:after="0"/>
         <w:jc w:val="center"/>
-        <w:spacing w:after="0"/>
       </w:pPr>
-      <w:r>
-        <w:t xml:space="preserve">duttasanjay098@gmail.com</w:t>
+      <w:hyperlink r:id="rId7" w:history="1">
+        <w:r>
+          <w:rPr>
+            <w:rStyle w:val="Hyperlink"/>
+          </w:rPr>
+          <w:t>duttasanjay098@gmail.com</w:t>
+        </w:r>
+      </w:hyperlink>
+      <w:r>
+        <w:t xml:space="preserve"> </w:t>
       </w:r>
     </w:p>
     <w:p>
@@ -3495,7 +3511,7 @@
                     <pic:cNvPicPr/>
                   </pic:nvPicPr>
                   <pic:blipFill>
-                    <a:blip r:embed="rId6"/>
+                    <a:blip r:embed="rId8"/>
                     <a:stretch>
                       <a:fillRect/>
                     </a:stretch>
@@ -6252,7 +6268,7 @@
                     <pic:cNvPicPr/>
                   </pic:nvPicPr>
                   <pic:blipFill>
-                    <a:blip r:embed="rId7"/>
+                    <a:blip r:embed="rId9"/>
                     <a:stretch>
                       <a:fillRect/>
                     </a:stretch>
@@ -6311,7 +6327,7 @@
                     <pic:cNvPicPr/>
                   </pic:nvPicPr>
                   <pic:blipFill>
-                    <a:blip r:embed="rId8"/>
+                    <a:blip r:embed="rId10"/>
                     <a:stretch>
                       <a:fillRect/>
                     </a:stretch>
@@ -9067,7 +9083,7 @@
                     <pic:cNvPicPr/>
                   </pic:nvPicPr>
                   <pic:blipFill>
-                    <a:blip r:embed="rId9"/>
+                    <a:blip r:embed="rId11"/>
                     <a:stretch>
                       <a:fillRect/>
                     </a:stretch>
@@ -12178,7 +12194,7 @@
                     <pic:cNvPicPr/>
                   </pic:nvPicPr>
                   <pic:blipFill>
-                    <a:blip r:embed="rId10"/>
+                    <a:blip r:embed="rId12"/>
                     <a:stretch>
                       <a:fillRect/>
                     </a:stretch>
@@ -16343,7 +16359,7 @@
                     <pic:cNvPicPr/>
                   </pic:nvPicPr>
                   <pic:blipFill>
-                    <a:blip r:embed="rId11"/>
+                    <a:blip r:embed="rId13"/>
                     <a:stretch>
                       <a:fillRect/>
                     </a:stretch>
@@ -16401,7 +16417,7 @@
                     <pic:cNvPicPr/>
                   </pic:nvPicPr>
                   <pic:blipFill>
-                    <a:blip r:embed="rId12"/>
+                    <a:blip r:embed="rId14"/>
                     <a:stretch>
                       <a:fillRect/>
                     </a:stretch>
@@ -19155,7 +19171,7 @@
                     <pic:cNvPicPr/>
                   </pic:nvPicPr>
                   <pic:blipFill>
-                    <a:blip r:embed="rId13"/>
+                    <a:blip r:embed="rId15"/>
                     <a:stretch>
                       <a:fillRect/>
                     </a:stretch>
@@ -20040,7 +20056,7 @@
                     <pic:cNvPicPr/>
                   </pic:nvPicPr>
                   <pic:blipFill>
-                    <a:blip r:embed="rId14"/>
+                    <a:blip r:embed="rId16"/>
                     <a:stretch>
                       <a:fillRect/>
                     </a:stretch>
@@ -23579,7 +23595,7 @@
                     <pic:cNvPicPr/>
                   </pic:nvPicPr>
                   <pic:blipFill>
-                    <a:blip r:embed="rId15"/>
+                    <a:blip r:embed="rId17"/>
                     <a:stretch>
                       <a:fillRect/>
                     </a:stretch>
@@ -24177,7 +24193,7 @@
                     <pic:cNvPicPr/>
                   </pic:nvPicPr>
                   <pic:blipFill>
-                    <a:blip r:embed="rId16"/>
+                    <a:blip r:embed="rId18"/>
                     <a:stretch>
                       <a:fillRect/>
                     </a:stretch>
@@ -26604,7 +26620,7 @@
                     <pic:cNvPicPr/>
                   </pic:nvPicPr>
                   <pic:blipFill>
-                    <a:blip r:embed="rId17"/>
+                    <a:blip r:embed="rId19"/>
                     <a:stretch>
                       <a:fillRect/>
                     </a:stretch>
@@ -26663,7 +26679,7 @@
                     <pic:cNvPicPr/>
                   </pic:nvPicPr>
                   <pic:blipFill>
-                    <a:blip r:embed="rId18"/>
+                    <a:blip r:embed="rId20"/>
                     <a:stretch>
                       <a:fillRect/>
                     </a:stretch>
@@ -28297,7 +28313,7 @@
                     <pic:cNvPicPr/>
                   </pic:nvPicPr>
                   <pic:blipFill>
-                    <a:blip r:embed="rId19"/>
+                    <a:blip r:embed="rId21"/>
                     <a:stretch>
                       <a:fillRect/>
                     </a:stretch>
@@ -31016,7 +31032,7 @@
                     <pic:cNvPicPr/>
                   </pic:nvPicPr>
                   <pic:blipFill>
-                    <a:blip r:embed="rId20"/>
+                    <a:blip r:embed="rId22"/>
                     <a:stretch>
                       <a:fillRect/>
                     </a:stretch>
@@ -32577,7 +32593,7 @@
                     <pic:cNvPicPr/>
                   </pic:nvPicPr>
                   <pic:blipFill>
-                    <a:blip r:embed="rId21"/>
+                    <a:blip r:embed="rId23"/>
                     <a:stretch>
                       <a:fillRect/>
                     </a:stretch>
@@ -32634,7 +32650,7 @@
                     <pic:cNvPicPr/>
                   </pic:nvPicPr>
                   <pic:blipFill>
-                    <a:blip r:embed="rId22"/>
+                    <a:blip r:embed="rId24"/>
                     <a:stretch>
                       <a:fillRect/>
                     </a:stretch>
@@ -33318,7 +33334,7 @@
                     <pic:cNvPicPr/>
                   </pic:nvPicPr>
                   <pic:blipFill>
-                    <a:blip r:embed="rId23"/>
+                    <a:blip r:embed="rId25"/>
                     <a:stretch>
                       <a:fillRect/>
                     </a:stretch>
@@ -33659,7 +33675,7 @@
                     <pic:cNvPicPr/>
                   </pic:nvPicPr>
                   <pic:blipFill>
-                    <a:blip r:embed="rId24"/>
+                    <a:blip r:embed="rId26"/>
                     <a:stretch>
                       <a:fillRect/>
                     </a:stretch>
@@ -33716,7 +33732,7 @@
                     <pic:cNvPicPr/>
                   </pic:nvPicPr>
                   <pic:blipFill>
-                    <a:blip r:embed="rId25"/>
+                    <a:blip r:embed="rId27"/>
                     <a:stretch>
                       <a:fillRect/>
                     </a:stretch>
@@ -33774,7 +33790,7 @@
                     <pic:cNvPicPr/>
                   </pic:nvPicPr>
                   <pic:blipFill>
-                    <a:blip r:embed="rId26"/>
+                    <a:blip r:embed="rId28"/>
                     <a:stretch>
                       <a:fillRect/>
                     </a:stretch>
@@ -34513,7 +34529,7 @@
                     <pic:cNvPicPr/>
                   </pic:nvPicPr>
                   <pic:blipFill>
-                    <a:blip r:embed="rId27"/>
+                    <a:blip r:embed="rId29"/>
                     <a:stretch>
                       <a:fillRect/>
                     </a:stretch>
@@ -35037,7 +35053,7 @@
                     <pic:cNvPicPr/>
                   </pic:nvPicPr>
                   <pic:blipFill>
-                    <a:blip r:embed="rId28"/>
+                    <a:blip r:embed="rId30"/>
                     <a:stretch>
                       <a:fillRect/>
                     </a:stretch>
@@ -36532,7 +36548,7 @@
                     <pic:cNvPicPr/>
                   </pic:nvPicPr>
                   <pic:blipFill>
-                    <a:blip r:embed="rId29"/>
+                    <a:blip r:embed="rId31"/>
                     <a:stretch>
                       <a:fillRect/>
                     </a:stretch>
@@ -37524,7 +37540,7 @@
         <w:jc w:val="both"/>
       </w:pPr>
       <w:r>
-        <w:t>The central puzzle in Section 6.3 is that debt enters Model 1 negative and significant in the pooled cross-state specification, and positive and significant in the within-state fixed-effects specification. Both estimates are correct. They answer different questions. The pooled coefficient asks whether a state that persistently carries less debt than its peers attracts more FDI than they do. It does, and the magnitude, roughly 18 per cent more FDI per percentage point of lower debt-to-GSDP, lines up with the discipline ranking of Section 4.7. The two lowest-debt states in the panel, Gujarat and Maharashtra, rank first or second overall in almost every year; the highest-debt state, West Bengal, ranks last in all five. It lines up too with the Spearman correlation of Section 6.2, which turns significant (rho = 0.728, p = 0.026) once the one state whose FDI series is an accounting artefact rather than a genuine low outcome is set aside.</w:t>
+        <w:t xml:space="preserve">The central puzzle in Section 6.3 is that debt enters Model 1 negative in the pooled cross-state specification and positive in the within-state fixed-effects specification, and that both are estimated precisely enough to take seriously: the pooled coefficient at p = 0.007 under cluster-robust inference and p = 0.057 under the wild cluster bootstrap of Section 6.7, the within-state coefficient at p = 0.031 under that same bootstrap. Both estimates are correct. They answer different questions. The pooled coefficient asks whether a state that persistently carries less debt than its peers attracts more FDI than they do. It does, and the magnitude, roughly 18 per cent more FDI per percentage point of lower debt-to-GSDP, lines up with the discipline ranking of Section 4.7. The two lowest-debt states in the panel, Gujarat and Maharashtra, rank first or second overall in almost every year; the highest-debt state, West Bengal, ranks last in all five. It lines up too with the Spearman correlation of Section 6.2, which turns significant (rho = 0.728, p = 0.026) once the one state whose FDI series is an accounting artefact rather than a genuine low outcome is set aside.</w:t>
       </w:r>
     </w:p>
     <w:p>
@@ -37532,44 +37548,7 @@
         <w:jc w:val="both"/>
       </w:pPr>
       <w:r>
-        <w:lastRenderedPageBreak/>
-        <w:t xml:space="preserve">The fixed effects coefficient is looking at something what happens in a state when its debt ratio goes up more than usual. Does the states Foreign Direct Investment or FDI go up too? The answer is yes. Not because the state is being responsible with its </w:t>
-      </w:r>
-      <w:proofErr w:type="spellStart"/>
-      <w:proofErr w:type="gramStart"/>
-      <w:r>
-        <w:t>money.We</w:t>
-      </w:r>
-      <w:proofErr w:type="spellEnd"/>
-      <w:proofErr w:type="gramEnd"/>
-      <w:r>
-        <w:t xml:space="preserve"> are looking at five years of data. One of those years FY 2020-21 was a tough time because of the pandemic. Every state had a deficit and a lot of debt all at once and at the same time FDI from other countries went down </w:t>
-      </w:r>
-      <w:proofErr w:type="gramStart"/>
-      <w:r>
-        <w:t>everywhere..</w:t>
-      </w:r>
-      <w:proofErr w:type="gramEnd"/>
-      <w:r>
-        <w:t xml:space="preserve"> Then FDI started to recover in FY 2021-22 and FY 2022-23. In some states this recovery happened when debt levels were still high because of the </w:t>
-      </w:r>
-      <w:proofErr w:type="spellStart"/>
-      <w:proofErr w:type="gramStart"/>
-      <w:r>
-        <w:t>pandemic.For</w:t>
-      </w:r>
-      <w:proofErr w:type="spellEnd"/>
-      <w:proofErr w:type="gramEnd"/>
-      <w:r>
-        <w:t xml:space="preserve"> example Gujarat had an increase in FDI in FY 2020-21 and Karnataka had one in FY 2021-22. Both of these increases happened when debt levels were still higher than they were before the pandemic. The problem is that we are only looking at five years of data so one big event like the pandemic can make it seem like there is a connection, between debt and FDI when </w:t>
-      </w:r>
-      <w:proofErr w:type="gramStart"/>
-      <w:r>
-        <w:t>really</w:t>
-      </w:r>
-      <w:proofErr w:type="gramEnd"/>
-      <w:r>
-        <w:t xml:space="preserve"> it's just because of the pandemic. Foreign Direct Investment or FDI and debt are both things that changed a lot during this time. It is hard to say what is really going on.</w:t>
+        <w:t xml:space="preserve">The fixed-effects coefficient asks a different question: when a state's own debt ratio rises above its usual level, does its FDI rise with it? Over this window it does, and not because borrowing attracts investors. Five years is a short series and one of them, FY 2020-21, is a shock common to every state. Deficits and debt rose everywhere at once while FDI fell everywhere; inflows then recovered through FY 2021-22 and FY 2022-23 while debt remained at its elevated pandemic level. Gujarat's FDI rose in FY 2020-21 and Karnataka's in FY 2021-22, both while debt stood above its pre-pandemic ratio. Debt and FDI therefore move together within states over this window for reasons that have little to do with either causing the other, and a five-year panel containing a shock of that size cannot separate them. The within-state estimate is best read as a description of the COVID window rather than as a behavioural relationship.</w:t>
       </w:r>
     </w:p>
     <w:p>
@@ -37596,7 +37575,7 @@
         <w:jc w:val="both"/>
       </w:pPr>
       <w:r>
-        <w:t>Capital expenditure enters the FDI specification with a negative and significant coefficient, -0.366 (p = 0.008). That is the opposite of what the crowding-in channel of Section 2 predicts, and it is worth taking seriously rather than explaining away. Two features of the measure account for most of it.</w:t>
+        <w:t xml:space="preserve">Capital expenditure enters the FDI specification with a negative coefficient, -0.366, significant under cluster-robust inference (p = 0.008) though not under the wild cluster bootstrap of Section 6.7 (p = 0.094). The paper accordingly rests no claim on it. The sign is nonetheless the opposite of what the crowding-in channel of Section 2 predicts, and it is stable enough across the specification curve to be worth explaining rather than dismissed. Two features of the measure account for most of it.</w:t>
       </w:r>
     </w:p>
     <w:p>
@@ -37648,7 +37627,7 @@
                     <pic:cNvPicPr/>
                   </pic:nvPicPr>
                   <pic:blipFill>
-                    <a:blip r:embed="rId30"/>
+                    <a:blip r:embed="rId32"/>
                     <a:stretch>
                       <a:fillRect/>
                     </a:stretch>
@@ -37692,50 +37671,58 @@
     </w:p>
     <w:p>
       <w:pPr>
+        <w:jc w:val="both"/>
+      </w:pPr>
+      <w:r>
+        <w:t xml:space="preserve">Jharkhand shows that discipline does not by itself deliver investment. It sits mid-table on the composite ranking, sixth of ten with an average score of 5.8, yet its FDI is the most erratic in the panel: a substantial inflow in FY 2019-20, then almost nothing from FY 2020-21 onward. Excluding it moves the within-state estimates more than excluding any other state (Section 6.5), which is why it is discussed separately rather than absorbed into the average. Its trajectory diverges sharply from Gujarat's or Karnataka's, and the reasons are specific rather than fiscal: political turnover, difficulties in the mining sector on which much of its investment case rests, and infrastructure that compares poorly with the states above it. Fiscal prudence appears necessary for a state to be considered; Jharkhand demonstrates that it is not sufficient for a state to be chosen.</w:t>
+      </w:r>
+    </w:p>
+    <w:p>
+      <w:pPr>
+        <w:jc w:val="both"/>
+      </w:pPr>
+      <w:r>
+        <w:t xml:space="preserve">Uttar Pradesh is the mirror case, and its anomaly is one of measurement rather than performance. DPIIT's series for the state begins only in FY 2021-22, so its first two cells are missing rather than zero. On fiscal discipline it ranks at or near the top throughout, first of ten with an average score of 2.2. Whether that censoring distorts the results was tested directly: dropping the state leaves the regression estimates substantially unchanged (Section 6.5), but it does move the Spearman correlation of Section 6.2 from insignificant to significant (rho = 0.728, p = 0.026). That pattern is what one would expect. A regression using forty-eight state-year observations absorbs two missing cells; a rank correlation that compresses each state to a single five-year total does not, because the missing years drag Uttar Pradesh's total down and its rank with it.</w:t>
+      </w:r>
+    </w:p>
+    <w:p>
+      <w:pPr>
         <w:pStyle w:val="Heading2"/>
-        <w:rPr>
-          <w:rFonts w:ascii="Times New Roman" w:eastAsiaTheme="minorEastAsia" w:hAnsi="Times New Roman" w:cstheme="minorBidi"/>
-          <w:b w:val="0"/>
-          <w:bCs w:val="0"/>
-          <w:color w:val="auto"/>
-          <w:sz w:val="22"/>
-          <w:szCs w:val="22"/>
-        </w:rPr>
       </w:pPr>
       <w:r>
-        <w:rPr>
-          <w:rFonts w:ascii="Times New Roman" w:eastAsiaTheme="minorEastAsia" w:hAnsi="Times New Roman" w:cstheme="minorBidi"/>
-          <w:b w:val="0"/>
-          <w:bCs w:val="0"/>
-          <w:color w:val="auto"/>
-          <w:sz w:val="22"/>
-          <w:szCs w:val="22"/>
-        </w:rPr>
-        <w:t xml:space="preserve">Jharkhand is an example of how discipline does not always lead to investment. Jharkhand has a ranking of 6 out of 10 with an average score of 5.8 but its FDI has been very unpredictable. Jharkhand had an increase in FDI in 2019-20 but then it almost disappeared from 2020-21 onwards. If we remove Jharkhand from the data the results change a lot. </w:t>
-      </w:r>
-      <w:proofErr w:type="spellStart"/>
-      <w:r>
-        <w:rPr>
-          <w:rFonts w:ascii="Times New Roman" w:eastAsiaTheme="minorEastAsia" w:hAnsi="Times New Roman" w:cstheme="minorBidi"/>
-          <w:b w:val="0"/>
-          <w:bCs w:val="0"/>
-          <w:color w:val="auto"/>
-          <w:sz w:val="22"/>
-          <w:szCs w:val="22"/>
-        </w:rPr>
-        <w:t>Jharkhands</w:t>
-      </w:r>
-      <w:proofErr w:type="spellEnd"/>
-      <w:r>
-        <w:rPr>
-          <w:rFonts w:ascii="Times New Roman" w:eastAsiaTheme="minorEastAsia" w:hAnsi="Times New Roman" w:cstheme="minorBidi"/>
-          <w:b w:val="0"/>
-          <w:bCs w:val="0"/>
-          <w:color w:val="auto"/>
-          <w:sz w:val="22"/>
-          <w:szCs w:val="22"/>
-        </w:rPr>
-        <w:t xml:space="preserve"> own story is very different from states like Gujarat and Karnataka. While they have been doing well Jharkhand has been struggling with a deficit and very little FDI. We think Jharkhand is important to include in the study because it shows that just because investors consider a place it does not mean they will choose it. There are reasons why Jharkhand is not doing well such as political changes, problems with the mining industry and a lack of infrastructure compared to other states.</w:t>
+        <w:t>7.4 What the agglomeration rival hypothesis survives</w:t>
+      </w:r>
+    </w:p>
+    <w:p>
+      <w:pPr>
+        <w:jc w:val="both"/>
+      </w:pPr>
+      <w:r>
+        <w:t xml:space="preserve">Section 3 set out the rival explanation: foreign investment follows existing industrial clusters and metropolitan markets, and a state's fiscal position is largely incidental to where it goes. Nothing in this study refutes that hypothesis. The results are better read as locating fiscal discipline within it than as displacing it.</w:t>
+      </w:r>
+    </w:p>
+    <w:p>
+      <w:pPr>
+        <w:jc w:val="both"/>
+      </w:pPr>
+      <w:r>
+        <w:t xml:space="preserve">The machine-learning stage speaks most directly to the point, though not in the direction the first run suggested. That run included the two Census controls and ranked urbanisation as the dominant predictor, which would have been a striking vindication of the agglomeration account. It was not one. Urbanisation is fixed within a state across all five years, so the forest was using it to identify which state an observation came from, re-learning the state fixed effect rather than measuring any agglomeration mechanism. The result is an artefact of the panel's shape and carries no evidence about clustering in either direction, which is why Section 5.2 reports it as a diagnostic failure and Section 6.6 excludes both controls. It cannot be cited in support of the rival hypothesis, and it is not cited here.</w:t>
+      </w:r>
+    </w:p>
+    <w:p>
+      <w:pPr>
+        <w:jc w:val="both"/>
+      </w:pPr>
+      <w:r>
+        <w:t xml:space="preserve">What the corrected analysis does show is that once attention is restricted to variation this panel can actually speak to, debt ranks first among the fiscal predictors in both the pooled and the state-demeaned specifications (Section 6.6). The pooled regression retains literacy and urbanisation as controls and the debt coefficient survives their inclusion, so the cross-state result is not merely a restatement of which states are already developed and urbanised.</w:t>
+      </w:r>
+    </w:p>
+    <w:p>
+      <w:pPr>
+        <w:jc w:val="both"/>
+      </w:pPr>
+      <w:r>
+        <w:t xml:space="preserve">The reading we take is that the two accounts operate at different levels rather than in competition. Structural advantages — location, port access, an established industrial base, the depth of a metropolitan labour market — determine which states are candidates for large inflows at all, and the ten states in this sample are precisely those that have already cleared that bar. Fiscal position then appears to sort investment among them. That is consistent with the between-state result of Section 7.1, and it is also why the finding should not be extrapolated: it describes how capital is allocated among states already in contention, not how a state enters contention in the first place. Section 8 returns to this as the study's principal limit on external validity.</w:t>
       </w:r>
     </w:p>
     <w:p>
@@ -37751,477 +37738,6 @@
         </w:rPr>
       </w:pPr>
       <w:r>
-        <w:rPr>
-          <w:rFonts w:ascii="Times New Roman" w:eastAsiaTheme="minorEastAsia" w:hAnsi="Times New Roman" w:cstheme="minorBidi"/>
-          <w:b w:val="0"/>
-          <w:bCs w:val="0"/>
-          <w:color w:val="auto"/>
-          <w:sz w:val="22"/>
-          <w:szCs w:val="22"/>
-        </w:rPr>
-        <w:t xml:space="preserve">Uttar Pradesh is a story. The data for Uttar Pradesh only starts from 2021-22 so we are missing information for the two years. Despite this Uttar Pradesh is always near the top when it comes to discipline with a ranking of 1 out of 10 and an average score of 2.2. We were worried that this missing data might be affecting our results. When we tested </w:t>
-      </w:r>
-      <w:proofErr w:type="gramStart"/>
-      <w:r>
-        <w:rPr>
-          <w:rFonts w:ascii="Times New Roman" w:eastAsiaTheme="minorEastAsia" w:hAnsi="Times New Roman" w:cstheme="minorBidi"/>
-          <w:b w:val="0"/>
-          <w:bCs w:val="0"/>
-          <w:color w:val="auto"/>
-          <w:sz w:val="22"/>
-          <w:szCs w:val="22"/>
-        </w:rPr>
-        <w:t>it</w:t>
-      </w:r>
-      <w:proofErr w:type="gramEnd"/>
-      <w:r>
-        <w:rPr>
-          <w:rFonts w:ascii="Times New Roman" w:eastAsiaTheme="minorEastAsia" w:hAnsi="Times New Roman" w:cstheme="minorBidi"/>
-          <w:b w:val="0"/>
-          <w:bCs w:val="0"/>
-          <w:color w:val="auto"/>
-          <w:sz w:val="22"/>
-          <w:szCs w:val="22"/>
-        </w:rPr>
-        <w:t xml:space="preserve"> we found that it was not a problem. If we remove Uttar Pradesh from the data the results do not change much. </w:t>
-      </w:r>
-      <w:proofErr w:type="gramStart"/>
-      <w:r>
-        <w:rPr>
-          <w:rFonts w:ascii="Times New Roman" w:eastAsiaTheme="minorEastAsia" w:hAnsi="Times New Roman" w:cstheme="minorBidi"/>
-          <w:b w:val="0"/>
-          <w:bCs w:val="0"/>
-          <w:color w:val="auto"/>
-          <w:sz w:val="22"/>
-          <w:szCs w:val="22"/>
-        </w:rPr>
-        <w:t>However</w:t>
-      </w:r>
-      <w:proofErr w:type="gramEnd"/>
-      <w:r>
-        <w:rPr>
-          <w:rFonts w:ascii="Times New Roman" w:eastAsiaTheme="minorEastAsia" w:hAnsi="Times New Roman" w:cstheme="minorBidi"/>
-          <w:b w:val="0"/>
-          <w:bCs w:val="0"/>
-          <w:color w:val="auto"/>
-          <w:sz w:val="22"/>
-          <w:szCs w:val="22"/>
-        </w:rPr>
-        <w:t xml:space="preserve"> when we look at the correlation between the </w:t>
-      </w:r>
-      <w:proofErr w:type="gramStart"/>
-      <w:r>
-        <w:rPr>
-          <w:rFonts w:ascii="Times New Roman" w:eastAsiaTheme="minorEastAsia" w:hAnsi="Times New Roman" w:cstheme="minorBidi"/>
-          <w:b w:val="0"/>
-          <w:bCs w:val="0"/>
-          <w:color w:val="auto"/>
-          <w:sz w:val="22"/>
-          <w:szCs w:val="22"/>
-        </w:rPr>
-        <w:t>data</w:t>
-      </w:r>
-      <w:proofErr w:type="gramEnd"/>
-      <w:r>
-        <w:rPr>
-          <w:rFonts w:ascii="Times New Roman" w:eastAsiaTheme="minorEastAsia" w:hAnsi="Times New Roman" w:cstheme="minorBidi"/>
-          <w:b w:val="0"/>
-          <w:bCs w:val="0"/>
-          <w:color w:val="auto"/>
-          <w:sz w:val="22"/>
-          <w:szCs w:val="22"/>
-        </w:rPr>
-        <w:t xml:space="preserve"> we do see a difference. When Uttar Pradesh is </w:t>
-      </w:r>
-      <w:proofErr w:type="gramStart"/>
-      <w:r>
-        <w:rPr>
-          <w:rFonts w:ascii="Times New Roman" w:eastAsiaTheme="minorEastAsia" w:hAnsi="Times New Roman" w:cstheme="minorBidi"/>
-          <w:b w:val="0"/>
-          <w:bCs w:val="0"/>
-          <w:color w:val="auto"/>
-          <w:sz w:val="22"/>
-          <w:szCs w:val="22"/>
-        </w:rPr>
-        <w:t>included</w:t>
-      </w:r>
-      <w:proofErr w:type="gramEnd"/>
-      <w:r>
-        <w:rPr>
-          <w:rFonts w:ascii="Times New Roman" w:eastAsiaTheme="minorEastAsia" w:hAnsi="Times New Roman" w:cstheme="minorBidi"/>
-          <w:b w:val="0"/>
-          <w:bCs w:val="0"/>
-          <w:color w:val="auto"/>
-          <w:sz w:val="22"/>
-          <w:szCs w:val="22"/>
-        </w:rPr>
-        <w:t xml:space="preserve"> the correlation is not significant. When it is removed it becomes significant. This is what we would expect to happen. The regression analysis is not affected by the missing data. The correlation is more sensitive, to it.</w:t>
-      </w:r>
-    </w:p>
-    <w:p>
-      <w:pPr>
-        <w:pStyle w:val="Heading2"/>
-        <w:rPr>
-          <w:rFonts w:ascii="Times New Roman" w:eastAsiaTheme="minorEastAsia" w:hAnsi="Times New Roman" w:cstheme="minorBidi"/>
-          <w:b w:val="0"/>
-          <w:bCs w:val="0"/>
-          <w:color w:val="auto"/>
-          <w:sz w:val="22"/>
-          <w:szCs w:val="22"/>
-        </w:rPr>
-      </w:pPr>
-      <w:r>
-        <w:t>7.4 What the agglomeration rival hypothesis survives</w:t>
-      </w:r>
-      <w:r>
-        <w:br/>
-      </w:r>
-      <w:r>
-        <w:br/>
-      </w:r>
-      <w:r>
-        <w:rPr>
-          <w:rFonts w:ascii="Times New Roman" w:eastAsiaTheme="minorEastAsia" w:hAnsi="Times New Roman" w:cstheme="minorBidi"/>
-          <w:b w:val="0"/>
-          <w:bCs w:val="0"/>
-          <w:color w:val="auto"/>
-          <w:sz w:val="22"/>
-          <w:szCs w:val="22"/>
-        </w:rPr>
-        <w:t xml:space="preserve">Section 3 looked at how </w:t>
-      </w:r>
-      <w:proofErr w:type="gramStart"/>
-      <w:r>
-        <w:rPr>
-          <w:rFonts w:ascii="Times New Roman" w:eastAsiaTheme="minorEastAsia" w:hAnsi="Times New Roman" w:cstheme="minorBidi"/>
-          <w:b w:val="0"/>
-          <w:bCs w:val="0"/>
-          <w:color w:val="auto"/>
-          <w:sz w:val="22"/>
-          <w:szCs w:val="22"/>
-        </w:rPr>
-        <w:t>companies</w:t>
-      </w:r>
-      <w:proofErr w:type="gramEnd"/>
-      <w:r>
-        <w:rPr>
-          <w:rFonts w:ascii="Times New Roman" w:eastAsiaTheme="minorEastAsia" w:hAnsi="Times New Roman" w:cstheme="minorBidi"/>
-          <w:b w:val="0"/>
-          <w:bCs w:val="0"/>
-          <w:color w:val="auto"/>
-          <w:sz w:val="22"/>
-          <w:szCs w:val="22"/>
-        </w:rPr>
-        <w:t xml:space="preserve"> group in certain areas and how this affects the money that comes into a country. It said that foreign companies like to set up in areas where other companies are already doing well and that the governments financial situation does not really matter. The information we have gathered does not completely. Disprove this idea. </w:t>
-      </w:r>
-      <w:proofErr w:type="gramStart"/>
-      <w:r>
-        <w:rPr>
-          <w:rFonts w:ascii="Times New Roman" w:eastAsiaTheme="minorEastAsia" w:hAnsi="Times New Roman" w:cstheme="minorBidi"/>
-          <w:b w:val="0"/>
-          <w:bCs w:val="0"/>
-          <w:color w:val="auto"/>
-          <w:sz w:val="22"/>
-          <w:szCs w:val="22"/>
-        </w:rPr>
-        <w:t>Instead</w:t>
-      </w:r>
-      <w:proofErr w:type="gramEnd"/>
-      <w:r>
-        <w:rPr>
-          <w:rFonts w:ascii="Times New Roman" w:eastAsiaTheme="minorEastAsia" w:hAnsi="Times New Roman" w:cstheme="minorBidi"/>
-          <w:b w:val="0"/>
-          <w:bCs w:val="0"/>
-          <w:color w:val="auto"/>
-          <w:sz w:val="22"/>
-          <w:szCs w:val="22"/>
-        </w:rPr>
-        <w:t xml:space="preserve"> it shows that a </w:t>
-      </w:r>
-      <w:proofErr w:type="spellStart"/>
-      <w:r>
-        <w:rPr>
-          <w:rFonts w:ascii="Times New Roman" w:eastAsiaTheme="minorEastAsia" w:hAnsi="Times New Roman" w:cstheme="minorBidi"/>
-          <w:b w:val="0"/>
-          <w:bCs w:val="0"/>
-          <w:color w:val="auto"/>
-          <w:sz w:val="22"/>
-          <w:szCs w:val="22"/>
-        </w:rPr>
-        <w:t>countrys</w:t>
-      </w:r>
-      <w:proofErr w:type="spellEnd"/>
-      <w:r>
-        <w:rPr>
-          <w:rFonts w:ascii="Times New Roman" w:eastAsiaTheme="minorEastAsia" w:hAnsi="Times New Roman" w:cstheme="minorBidi"/>
-          <w:b w:val="0"/>
-          <w:bCs w:val="0"/>
-          <w:color w:val="auto"/>
-          <w:sz w:val="22"/>
-          <w:szCs w:val="22"/>
-        </w:rPr>
-        <w:t xml:space="preserve"> financial responsibility is a part of </w:t>
-      </w:r>
-      <w:proofErr w:type="spellStart"/>
-      <w:proofErr w:type="gramStart"/>
-      <w:r>
-        <w:rPr>
-          <w:rFonts w:ascii="Times New Roman" w:eastAsiaTheme="minorEastAsia" w:hAnsi="Times New Roman" w:cstheme="minorBidi"/>
-          <w:b w:val="0"/>
-          <w:bCs w:val="0"/>
-          <w:color w:val="auto"/>
-          <w:sz w:val="22"/>
-          <w:szCs w:val="22"/>
-        </w:rPr>
-        <w:t>this.Remember</w:t>
-      </w:r>
-      <w:proofErr w:type="spellEnd"/>
-      <w:proofErr w:type="gramEnd"/>
-      <w:r>
-        <w:rPr>
-          <w:rFonts w:ascii="Times New Roman" w:eastAsiaTheme="minorEastAsia" w:hAnsi="Times New Roman" w:cstheme="minorBidi"/>
-          <w:b w:val="0"/>
-          <w:bCs w:val="0"/>
-          <w:color w:val="auto"/>
-          <w:sz w:val="22"/>
-          <w:szCs w:val="22"/>
-        </w:rPr>
-        <w:t xml:space="preserve"> the study we did in Section 5.2 where we looked at how </w:t>
-      </w:r>
-      <w:proofErr w:type="spellStart"/>
-      <w:r>
-        <w:rPr>
-          <w:rFonts w:ascii="Times New Roman" w:eastAsiaTheme="minorEastAsia" w:hAnsi="Times New Roman" w:cstheme="minorBidi"/>
-          <w:b w:val="0"/>
-          <w:bCs w:val="0"/>
-          <w:color w:val="auto"/>
-          <w:sz w:val="22"/>
-          <w:szCs w:val="22"/>
-        </w:rPr>
-        <w:t>citiesre</w:t>
-      </w:r>
-      <w:proofErr w:type="spellEnd"/>
-      <w:r>
-        <w:rPr>
-          <w:rFonts w:ascii="Times New Roman" w:eastAsiaTheme="minorEastAsia" w:hAnsi="Times New Roman" w:cstheme="minorBidi"/>
-          <w:b w:val="0"/>
-          <w:bCs w:val="0"/>
-          <w:color w:val="auto"/>
-          <w:sz w:val="22"/>
-          <w:szCs w:val="22"/>
-        </w:rPr>
-        <w:t xml:space="preserve"> growing and how this affects the economy. We found that city growth was a more important factor than the </w:t>
-      </w:r>
-      <w:proofErr w:type="spellStart"/>
-      <w:r>
-        <w:rPr>
-          <w:rFonts w:ascii="Times New Roman" w:eastAsiaTheme="minorEastAsia" w:hAnsi="Times New Roman" w:cstheme="minorBidi"/>
-          <w:b w:val="0"/>
-          <w:bCs w:val="0"/>
-          <w:color w:val="auto"/>
-          <w:sz w:val="22"/>
-          <w:szCs w:val="22"/>
-        </w:rPr>
-        <w:t>countrys</w:t>
-      </w:r>
-      <w:proofErr w:type="spellEnd"/>
-      <w:r>
-        <w:rPr>
-          <w:rFonts w:ascii="Times New Roman" w:eastAsiaTheme="minorEastAsia" w:hAnsi="Times New Roman" w:cstheme="minorBidi"/>
-          <w:b w:val="0"/>
-          <w:bCs w:val="0"/>
-          <w:color w:val="auto"/>
-          <w:sz w:val="22"/>
-          <w:szCs w:val="22"/>
-        </w:rPr>
-        <w:t xml:space="preserve"> debt. </w:t>
-      </w:r>
-      <w:proofErr w:type="gramStart"/>
-      <w:r>
-        <w:rPr>
-          <w:rFonts w:ascii="Times New Roman" w:eastAsiaTheme="minorEastAsia" w:hAnsi="Times New Roman" w:cstheme="minorBidi"/>
-          <w:b w:val="0"/>
-          <w:bCs w:val="0"/>
-          <w:color w:val="auto"/>
-          <w:sz w:val="22"/>
-          <w:szCs w:val="22"/>
-        </w:rPr>
-        <w:t>However</w:t>
-      </w:r>
-      <w:proofErr w:type="gramEnd"/>
-      <w:r>
-        <w:rPr>
-          <w:rFonts w:ascii="Times New Roman" w:eastAsiaTheme="minorEastAsia" w:hAnsi="Times New Roman" w:cstheme="minorBidi"/>
-          <w:b w:val="0"/>
-          <w:bCs w:val="0"/>
-          <w:color w:val="auto"/>
-          <w:sz w:val="22"/>
-          <w:szCs w:val="22"/>
-        </w:rPr>
-        <w:t xml:space="preserve"> we realized that some of the information was not accurate and we had to make some corrections in Section 6.6. After making these corrections we still think that city growth is an important factor because it shows how companies are grouping together in certain areas and how this affects the </w:t>
-      </w:r>
-      <w:proofErr w:type="spellStart"/>
-      <w:proofErr w:type="gramStart"/>
-      <w:r>
-        <w:rPr>
-          <w:rFonts w:ascii="Times New Roman" w:eastAsiaTheme="minorEastAsia" w:hAnsi="Times New Roman" w:cstheme="minorBidi"/>
-          <w:b w:val="0"/>
-          <w:bCs w:val="0"/>
-          <w:color w:val="auto"/>
-          <w:sz w:val="22"/>
-          <w:szCs w:val="22"/>
-        </w:rPr>
-        <w:t>market.When</w:t>
-      </w:r>
-      <w:proofErr w:type="spellEnd"/>
-      <w:proofErr w:type="gramEnd"/>
-      <w:r>
-        <w:rPr>
-          <w:rFonts w:ascii="Times New Roman" w:eastAsiaTheme="minorEastAsia" w:hAnsi="Times New Roman" w:cstheme="minorBidi"/>
-          <w:b w:val="0"/>
-          <w:bCs w:val="0"/>
-          <w:color w:val="auto"/>
-          <w:sz w:val="22"/>
-          <w:szCs w:val="22"/>
-        </w:rPr>
-        <w:t xml:space="preserve"> we looked at the information in a way using only the factors that change over time within a </w:t>
-      </w:r>
-      <w:proofErr w:type="gramStart"/>
-      <w:r>
-        <w:rPr>
-          <w:rFonts w:ascii="Times New Roman" w:eastAsiaTheme="minorEastAsia" w:hAnsi="Times New Roman" w:cstheme="minorBidi"/>
-          <w:b w:val="0"/>
-          <w:bCs w:val="0"/>
-          <w:color w:val="auto"/>
-          <w:sz w:val="22"/>
-          <w:szCs w:val="22"/>
-        </w:rPr>
-        <w:t>country</w:t>
-      </w:r>
-      <w:proofErr w:type="gramEnd"/>
-      <w:r>
-        <w:rPr>
-          <w:rFonts w:ascii="Times New Roman" w:eastAsiaTheme="minorEastAsia" w:hAnsi="Times New Roman" w:cstheme="minorBidi"/>
-          <w:b w:val="0"/>
-          <w:bCs w:val="0"/>
-          <w:color w:val="auto"/>
-          <w:sz w:val="22"/>
-          <w:szCs w:val="22"/>
-        </w:rPr>
-        <w:t xml:space="preserve"> we found that debt was actually a more important factor. </w:t>
-      </w:r>
-      <w:proofErr w:type="gramStart"/>
-      <w:r>
-        <w:rPr>
-          <w:rFonts w:ascii="Times New Roman" w:eastAsiaTheme="minorEastAsia" w:hAnsi="Times New Roman" w:cstheme="minorBidi"/>
-          <w:b w:val="0"/>
-          <w:bCs w:val="0"/>
-          <w:color w:val="auto"/>
-          <w:sz w:val="22"/>
-          <w:szCs w:val="22"/>
-        </w:rPr>
-        <w:t>So</w:t>
-      </w:r>
-      <w:proofErr w:type="gramEnd"/>
-      <w:r>
-        <w:rPr>
-          <w:rFonts w:ascii="Times New Roman" w:eastAsiaTheme="minorEastAsia" w:hAnsi="Times New Roman" w:cstheme="minorBidi"/>
-          <w:b w:val="0"/>
-          <w:bCs w:val="0"/>
-          <w:color w:val="auto"/>
-          <w:sz w:val="22"/>
-          <w:szCs w:val="22"/>
-        </w:rPr>
-        <w:t xml:space="preserve"> what does this mean? It means that the two explanations for how </w:t>
-      </w:r>
-      <w:proofErr w:type="gramStart"/>
-      <w:r>
-        <w:rPr>
-          <w:rFonts w:ascii="Times New Roman" w:eastAsiaTheme="minorEastAsia" w:hAnsi="Times New Roman" w:cstheme="minorBidi"/>
-          <w:b w:val="0"/>
-          <w:bCs w:val="0"/>
-          <w:color w:val="auto"/>
-          <w:sz w:val="22"/>
-          <w:szCs w:val="22"/>
-        </w:rPr>
-        <w:t>companies</w:t>
-      </w:r>
-      <w:proofErr w:type="gramEnd"/>
-      <w:r>
-        <w:rPr>
-          <w:rFonts w:ascii="Times New Roman" w:eastAsiaTheme="minorEastAsia" w:hAnsi="Times New Roman" w:cstheme="minorBidi"/>
-          <w:b w:val="0"/>
-          <w:bCs w:val="0"/>
-          <w:color w:val="auto"/>
-          <w:sz w:val="22"/>
-          <w:szCs w:val="22"/>
-        </w:rPr>
-        <w:t xml:space="preserve"> group </w:t>
-      </w:r>
-      <w:proofErr w:type="spellStart"/>
-      <w:r>
-        <w:rPr>
-          <w:rFonts w:ascii="Times New Roman" w:eastAsiaTheme="minorEastAsia" w:hAnsi="Times New Roman" w:cstheme="minorBidi"/>
-          <w:b w:val="0"/>
-          <w:bCs w:val="0"/>
-          <w:color w:val="auto"/>
-          <w:sz w:val="22"/>
-          <w:szCs w:val="22"/>
-        </w:rPr>
-        <w:t>together're</w:t>
-      </w:r>
-      <w:proofErr w:type="spellEnd"/>
-      <w:r>
-        <w:rPr>
-          <w:rFonts w:ascii="Times New Roman" w:eastAsiaTheme="minorEastAsia" w:hAnsi="Times New Roman" w:cstheme="minorBidi"/>
-          <w:b w:val="0"/>
-          <w:bCs w:val="0"/>
-          <w:color w:val="auto"/>
-          <w:sz w:val="22"/>
-          <w:szCs w:val="22"/>
-        </w:rPr>
-        <w:t xml:space="preserve"> not competing with each other but rather they are working at different levels. Some states have advantages, such as a good location and existing industries, which make them more attractive to companies. Then within these states financial responsibility plays a role, in determining which companies will be </w:t>
-      </w:r>
-      <w:proofErr w:type="spellStart"/>
-      <w:proofErr w:type="gramStart"/>
-      <w:r>
-        <w:rPr>
-          <w:rFonts w:ascii="Times New Roman" w:eastAsiaTheme="minorEastAsia" w:hAnsi="Times New Roman" w:cstheme="minorBidi"/>
-          <w:b w:val="0"/>
-          <w:bCs w:val="0"/>
-          <w:color w:val="auto"/>
-          <w:sz w:val="22"/>
-          <w:szCs w:val="22"/>
-        </w:rPr>
-        <w:t>successful.This</w:t>
-      </w:r>
-      <w:proofErr w:type="spellEnd"/>
-      <w:proofErr w:type="gramEnd"/>
-      <w:r>
-        <w:rPr>
-          <w:rFonts w:ascii="Times New Roman" w:eastAsiaTheme="minorEastAsia" w:hAnsi="Times New Roman" w:cstheme="minorBidi"/>
-          <w:b w:val="0"/>
-          <w:bCs w:val="0"/>
-          <w:color w:val="auto"/>
-          <w:sz w:val="22"/>
-          <w:szCs w:val="22"/>
-        </w:rPr>
-        <w:t xml:space="preserve"> idea is supported by the results we found in Section 7.1 which compared states. It also shows that financial policy is not irrelevant even when we consider how companies are grouping together in areas. Foreign Direct Investment or FDI is still a factor and financial discipline plays a role in determining where FDI will go.</w:t>
-      </w:r>
-    </w:p>
-    <w:p>
-      <w:pPr>
-        <w:pStyle w:val="Heading2"/>
-        <w:rPr>
-          <w:rFonts w:ascii="Times New Roman" w:eastAsiaTheme="minorEastAsia" w:hAnsi="Times New Roman" w:cstheme="minorBidi"/>
-          <w:b w:val="0"/>
-          <w:bCs w:val="0"/>
-          <w:color w:val="auto"/>
-          <w:sz w:val="22"/>
-          <w:szCs w:val="22"/>
-        </w:rPr>
-      </w:pPr>
-      <w:r>
         <w:t>8. Conclusion, Policy Implications and Limitations</w:t>
       </w:r>
     </w:p>
@@ -38485,6 +38001,7 @@
         <w:pStyle w:val="Heading1"/>
       </w:pPr>
       <w:r>
+        <w:lastRenderedPageBreak/>
         <w:t>Data and Code Availability</w:t>
       </w:r>
     </w:p>
@@ -38493,7 +38010,7 @@
         <w:jc w:val="both"/>
       </w:pPr>
       <w:r>
-        <w:t xml:space="preserve">The complete dataset, analysis code, results and this manuscript are openly available at https://github.com/fbivinay/Fiscal-Discipline-and-Investment-Outcomes. The repository contains the audited source series, the 50-row analysis panel used in every estimate reported here, all five analysis scripts, and the full set of tables and figures, so that each result can be reproduced from the raw inputs. It also retains the superseded seven-variable machine-learning run discussed in Section 5.2, so that the leakage diagnosis reported there can be verified rather than taken on trust.</w:t>
+        <w:t>The complete dataset, analysis code, results and this manuscript are openly available at https://github.com/fbivinay/Fiscal-Discipline-and-Investment-Outcomes. The repository contains the audited source series, the 50-row analysis panel used in every estimate reported here, all five analysis scripts, and the full set of tables and figures, so that each result can be reproduced from the raw inputs. It also retains the superseded seven-variable machine-learning run discussed in Section 5.2, so that the leakage diagnosis reported there can be verified rather than taken on trust.</w:t>
       </w:r>
     </w:p>
     <w:p>
@@ -38501,7 +38018,6 @@
         <w:pStyle w:val="Heading1"/>
       </w:pPr>
       <w:r>
-        <w:lastRenderedPageBreak/>
         <w:t>References</w:t>
       </w:r>
     </w:p>
@@ -38516,7 +38032,7 @@
         </w:rPr>
         <w:t xml:space="preserve">Arellano, M., &amp; Bond, S. (1991). Some tests of specification for panel data: Monte Carlo evidence and an application to employment equations. Review of Economic Studies, 58(2), 277-297. </w:t>
       </w:r>
-      <w:hyperlink r:id="rId31" w:history="1">
+      <w:hyperlink r:id="rId33" w:history="1">
         <w:r>
           <w:rPr>
             <w:rStyle w:val="Hyperlink"/>
@@ -38557,7 +38073,7 @@
         </w:rPr>
         <w:t xml:space="preserve">, G. W. (2019). Machine learning methods that economists should know about. Annual Review of Economics, 11, 685-725. </w:t>
       </w:r>
-      <w:hyperlink r:id="rId32" w:history="1">
+      <w:hyperlink r:id="rId34" w:history="1">
         <w:r>
           <w:rPr>
             <w:rStyle w:val="Hyperlink"/>
@@ -38592,7 +38108,7 @@
         </w:rPr>
         <w:t xml:space="preserve">, B. H. (2021). Econometric analysis of panel data (6th ed.). Springer. </w:t>
       </w:r>
-      <w:hyperlink r:id="rId33" w:history="1">
+      <w:hyperlink r:id="rId35" w:history="1">
         <w:r>
           <w:rPr>
             <w:rStyle w:val="Hyperlink"/>
@@ -38619,7 +38135,7 @@
         </w:rPr>
         <w:t xml:space="preserve">Barro, R. J. (1990). Government spending in a simple model of endogenous growth. Journal of Political Economy, 98(5, Pt. 2), S103-S125. </w:t>
       </w:r>
-      <w:hyperlink r:id="rId34" w:history="1">
+      <w:hyperlink r:id="rId36" w:history="1">
         <w:r>
           <w:rPr>
             <w:rStyle w:val="Hyperlink"/>
@@ -38646,7 +38162,7 @@
         </w:rPr>
         <w:t xml:space="preserve">Blonigen, B. A. (2005). A review of the empirical literature on FDI determinants. Atlantic Economic Journal, 33(4), 383-403. </w:t>
       </w:r>
-      <w:hyperlink r:id="rId35" w:history="1">
+      <w:hyperlink r:id="rId37" w:history="1">
         <w:r>
           <w:rPr>
             <w:rStyle w:val="Hyperlink"/>
@@ -38681,7 +38197,7 @@
         </w:rPr>
         <w:t xml:space="preserve">, E., De Gregorio, J., &amp; Lee, J.-W. (1998). How does foreign direct investment affect economic growth? Journal of International Economics, 45(1), 115-135. </w:t>
       </w:r>
-      <w:hyperlink r:id="rId36" w:history="1">
+      <w:hyperlink r:id="rId38" w:history="1">
         <w:r>
           <w:rPr>
             <w:rStyle w:val="Hyperlink"/>
@@ -38716,7 +38232,7 @@
         </w:rPr>
         <w:t xml:space="preserve">, L. (2001). Random forests. Machine Learning, 45(1), 5-32. </w:t>
       </w:r>
-      <w:hyperlink r:id="rId37" w:history="1">
+      <w:hyperlink r:id="rId39" w:history="1">
         <w:r>
           <w:rPr>
             <w:rStyle w:val="Hyperlink"/>
@@ -38755,7 +38271,7 @@
         </w:rPr>
         <w:t xml:space="preserve">Department for Promotion of Industry and Internal Trade (DPIIT). (2024). State-wise FDI equity inflows (from October 2019). Ministry of Commerce and Industry, Government of India. </w:t>
       </w:r>
-      <w:hyperlink r:id="rId38" w:history="1">
+      <w:hyperlink r:id="rId40" w:history="1">
         <w:r>
           <w:rPr>
             <w:rStyle w:val="Hyperlink"/>
@@ -38782,7 +38298,7 @@
         </w:rPr>
         <w:t xml:space="preserve">Driscoll, J. C., &amp; Kraay, A. C. (1998). Consistent covariance matrix estimation with spatially dependent panel data. Review of Economics and Statistics, 80(4), 549-560. </w:t>
       </w:r>
-      <w:hyperlink r:id="rId39" w:history="1">
+      <w:hyperlink r:id="rId41" w:history="1">
         <w:r>
           <w:rPr>
             <w:rStyle w:val="Hyperlink"/>
@@ -38809,7 +38325,7 @@
         </w:rPr>
         <w:t xml:space="preserve">Drukker, D. M. (2003). Testing for serial correlation in linear panel-data models. Stata Journal, 3(2), 168-177. </w:t>
       </w:r>
-      <w:hyperlink r:id="rId40" w:history="1">
+      <w:hyperlink r:id="rId42" w:history="1">
         <w:r>
           <w:rPr>
             <w:rStyle w:val="Hyperlink"/>
@@ -38836,7 +38352,7 @@
         </w:rPr>
         <w:t xml:space="preserve">Dunning, J. H. (1993). Multinational enterprises and the global economy. Addison-Wesley. </w:t>
       </w:r>
-      <w:hyperlink r:id="rId41" w:history="1">
+      <w:hyperlink r:id="rId43" w:history="1">
         <w:r>
           <w:rPr>
             <w:rStyle w:val="Hyperlink"/>
@@ -38891,7 +38407,7 @@
         </w:rPr>
         <w:t xml:space="preserve">, C. A. (2024). Fiscal federalism and foreign direct investment: An empirical analysis. The World Economy, 47(6), 2287-2331. </w:t>
       </w:r>
-      <w:hyperlink r:id="rId42" w:history="1">
+      <w:hyperlink r:id="rId44" w:history="1">
         <w:r>
           <w:rPr>
             <w:rStyle w:val="Hyperlink"/>
@@ -38918,7 +38434,7 @@
         </w:rPr>
         <w:t xml:space="preserve">Fischer, S. (1993). The role of macroeconomic factors in growth. Journal of Monetary Economics, 32(3), 485-512. </w:t>
       </w:r>
-      <w:hyperlink r:id="rId43" w:history="1">
+      <w:hyperlink r:id="rId45" w:history="1">
         <w:r>
           <w:rPr>
             <w:rStyle w:val="Hyperlink"/>
@@ -38943,9 +38459,10 @@
         <w:rPr>
           <w:sz w:val="21"/>
         </w:rPr>
+        <w:lastRenderedPageBreak/>
         <w:t xml:space="preserve">Government of India. (2025). Report of the Sixteenth Finance Commission, Volume II: Annexures. Ministry of Finance. </w:t>
       </w:r>
-      <w:hyperlink r:id="rId44" w:history="1">
+      <w:hyperlink r:id="rId46" w:history="1">
         <w:r>
           <w:rPr>
             <w:rStyle w:val="Hyperlink"/>
@@ -38986,7 +38503,7 @@
         </w:rPr>
         <w:t xml:space="preserve">, R., &amp; Friedman, J. (2009). The elements of statistical learning: Data mining, inference, and prediction (2nd ed.). Springer. </w:t>
       </w:r>
-      <w:hyperlink r:id="rId45" w:history="1">
+      <w:hyperlink r:id="rId47" w:history="1">
         <w:r>
           <w:rPr>
             <w:rStyle w:val="Hyperlink"/>
@@ -39027,7 +38544,7 @@
         </w:rPr>
         <w:t xml:space="preserve">, 46(6), 1251-1271. </w:t>
       </w:r>
-      <w:hyperlink r:id="rId46" w:history="1">
+      <w:hyperlink r:id="rId48" w:history="1">
         <w:r>
           <w:rPr>
             <w:rStyle w:val="Hyperlink"/>
@@ -39054,7 +38571,7 @@
         </w:rPr>
         <w:t xml:space="preserve">International Monetary Fund. (2020). World economic outlook, April 2020: The great lockdown. IMF. </w:t>
       </w:r>
-      <w:hyperlink r:id="rId47" w:history="1">
+      <w:hyperlink r:id="rId49" w:history="1">
         <w:r>
           <w:rPr>
             <w:rStyle w:val="Hyperlink"/>
@@ -39079,10 +38596,9 @@
         <w:rPr>
           <w:sz w:val="21"/>
         </w:rPr>
-        <w:lastRenderedPageBreak/>
         <w:t xml:space="preserve">Lundberg, S. M., &amp; Lee, S.-I. (2017). A unified approach to interpreting model predictions. Advances in Neural Information Processing Systems, 30, 4765-4774. </w:t>
       </w:r>
-      <w:hyperlink r:id="rId48" w:history="1">
+      <w:hyperlink r:id="rId50" w:history="1">
         <w:r>
           <w:rPr>
             <w:rStyle w:val="Hyperlink"/>
@@ -39109,7 +38625,7 @@
         </w:rPr>
         <w:t xml:space="preserve">Mahatekar, D. D. (2025). State-wise foreign direct investment (FDI) flows and economic impacts in India: A comparative study (2019-2024). JETIR, 12(10). </w:t>
       </w:r>
-      <w:hyperlink r:id="rId49" w:history="1">
+      <w:hyperlink r:id="rId51" w:history="1">
         <w:r>
           <w:rPr>
             <w:rStyle w:val="Hyperlink"/>
@@ -39176,7 +38692,7 @@
         </w:rPr>
         <w:t xml:space="preserve">). (2024). State-wise Gross State Domestic Product, 2011-12 series. Government of India. </w:t>
       </w:r>
-      <w:hyperlink r:id="rId50" w:history="1">
+      <w:hyperlink r:id="rId52" w:history="1">
         <w:r>
           <w:rPr>
             <w:rStyle w:val="Hyperlink"/>
@@ -39203,7 +38719,7 @@
         </w:rPr>
         <w:t xml:space="preserve">Misra, S., Gupta, K., &amp; Trivedi, P. (2021). Sub-national government debt sustainability in India: An empirical analysis. Macroeconomics and Finance in Emerging Market Economies, 16(1), 57-79. </w:t>
       </w:r>
-      <w:hyperlink r:id="rId51" w:history="1">
+      <w:hyperlink r:id="rId53" w:history="1">
         <w:r>
           <w:rPr>
             <w:rStyle w:val="Hyperlink"/>
@@ -39230,7 +38746,7 @@
         </w:rPr>
         <w:t xml:space="preserve">Mullainathan, S., &amp; Spiess, J. (2017). Machine learning: An applied econometric approach. Journal of Economic Perspectives, 31(2), 87-106. </w:t>
       </w:r>
-      <w:hyperlink r:id="rId52" w:history="1">
+      <w:hyperlink r:id="rId54" w:history="1">
         <w:r>
           <w:rPr>
             <w:rStyle w:val="Hyperlink"/>
@@ -39257,7 +38773,7 @@
         </w:rPr>
         <w:t xml:space="preserve">National Institute of Public Finance and Policy (NIPFP). (2024). How much debt is optimal for the major Indian states? Economic growth vs. debt sustainability (Working Paper No. 411). </w:t>
       </w:r>
-      <w:hyperlink r:id="rId53" w:history="1">
+      <w:hyperlink r:id="rId55" w:history="1">
         <w:r>
           <w:rPr>
             <w:rStyle w:val="Hyperlink"/>
@@ -39284,7 +38800,7 @@
         </w:rPr>
         <w:t xml:space="preserve">NITI Aayog. (2025). Fiscal Health Index 2025. Government of India. </w:t>
       </w:r>
-      <w:hyperlink r:id="rId54" w:history="1">
+      <w:hyperlink r:id="rId56" w:history="1">
         <w:r>
           <w:rPr>
             <w:rStyle w:val="Hyperlink"/>
@@ -39311,7 +38827,7 @@
         </w:rPr>
         <w:t xml:space="preserve">NITI Aayog. (2026). Fiscal Health Index 2026. Government of India. </w:t>
       </w:r>
-      <w:hyperlink r:id="rId55" w:history="1">
+      <w:hyperlink r:id="rId57" w:history="1">
         <w:r>
           <w:rPr>
             <w:rStyle w:val="Hyperlink"/>
@@ -39338,7 +38854,7 @@
         </w:rPr>
         <w:t xml:space="preserve">Oates, W. E. (1972). Fiscal federalism. Harcourt Brace Jovanovich. </w:t>
       </w:r>
-      <w:hyperlink r:id="rId56" w:history="1">
+      <w:hyperlink r:id="rId58" w:history="1">
         <w:r>
           <w:rPr>
             <w:rStyle w:val="Hyperlink"/>
@@ -39365,7 +38881,7 @@
         </w:rPr>
         <w:t xml:space="preserve">O'Brien, R. M. (2007). A caution regarding rules of thumb for variance inflation factors. Quality &amp; Quantity, 41(5), 673-690. </w:t>
       </w:r>
-      <w:hyperlink r:id="rId57" w:history="1">
+      <w:hyperlink r:id="rId59" w:history="1">
         <w:r>
           <w:rPr>
             <w:rStyle w:val="Hyperlink"/>
@@ -39392,7 +38908,7 @@
         </w:rPr>
         <w:t xml:space="preserve">Office of the Registrar General &amp; Census Commissioner, India. (2011). Census of India 2011, primary census abstract. Ministry of Home Affairs, Government of India. </w:t>
       </w:r>
-      <w:hyperlink r:id="rId58" w:history="1">
+      <w:hyperlink r:id="rId60" w:history="1">
         <w:r>
           <w:rPr>
             <w:rStyle w:val="Hyperlink"/>
@@ -39419,7 +38935,7 @@
         </w:rPr>
         <w:t xml:space="preserve">Panda, M., &amp; Sahay, S. (2022). Determinants of economic growth across states in India. In S. R. Hashim, R. Mukherji, &amp; B. Mishra (Eds.), Perspectives on inclusive policies for development in India (pp. 133-152). Springer. </w:t>
       </w:r>
-      <w:hyperlink r:id="rId59" w:history="1">
+      <w:hyperlink r:id="rId61" w:history="1">
         <w:r>
           <w:rPr>
             <w:rStyle w:val="Hyperlink"/>
@@ -39454,7 +38970,7 @@
         </w:rPr>
         <w:t xml:space="preserve">, M. H. (2015). Testing weak cross-sectional dependence in large panels. Econometric Reviews, 34(6-10), 1089-1117. </w:t>
       </w:r>
-      <w:hyperlink r:id="rId60" w:history="1">
+      <w:hyperlink r:id="rId62" w:history="1">
         <w:r>
           <w:rPr>
             <w:rStyle w:val="Hyperlink"/>
@@ -39481,7 +38997,7 @@
         </w:rPr>
         <w:t xml:space="preserve">Rao, M. G., &amp; Singh, N. (2005). The political economy of federalism in India. Oxford University Press. </w:t>
       </w:r>
-      <w:hyperlink r:id="rId61" w:history="1">
+      <w:hyperlink r:id="rId63" w:history="1">
         <w:r>
           <w:rPr>
             <w:rStyle w:val="Hyperlink"/>
@@ -39508,7 +39024,7 @@
         </w:rPr>
         <w:t xml:space="preserve">Reserve Bank of India. (2024). State finances: A study of budgets, 2023-24. RBI. </w:t>
       </w:r>
-      <w:hyperlink r:id="rId62" w:history="1">
+      <w:hyperlink r:id="rId64" w:history="1">
         <w:r>
           <w:rPr>
             <w:rStyle w:val="Hyperlink"/>
@@ -39533,9 +39049,10 @@
         <w:rPr>
           <w:sz w:val="21"/>
         </w:rPr>
+        <w:lastRenderedPageBreak/>
         <w:t xml:space="preserve">Roodman, D. (2009). How to do xtabond2: An introduction to difference and system GMM in Stata. Stata Journal, 9(1), 86-136. </w:t>
       </w:r>
-      <w:hyperlink r:id="rId63" w:history="1">
+      <w:hyperlink r:id="rId65" w:history="1">
         <w:r>
           <w:rPr>
             <w:rStyle w:val="Hyperlink"/>
@@ -39562,7 +39079,7 @@
         </w:rPr>
         <w:t xml:space="preserve">Spearman, C. (1904). The proof and measurement of association between two things. American Journal of Psychology, 15(1), 72-101. </w:t>
       </w:r>
-      <w:hyperlink r:id="rId64" w:history="1">
+      <w:hyperlink r:id="rId66" w:history="1">
         <w:r>
           <w:rPr>
             <w:rStyle w:val="Hyperlink"/>
@@ -39597,7 +39114,7 @@
         </w:rPr>
         <w:t xml:space="preserve">, R. (1996). Regression shrinkage and selection via the lasso. Journal of the Royal Statistical Society, Series B, 58(1), 267-288. </w:t>
       </w:r>
-      <w:hyperlink r:id="rId65" w:history="1">
+      <w:hyperlink r:id="rId67" w:history="1">
         <w:r>
           <w:rPr>
             <w:rStyle w:val="Hyperlink"/>
@@ -39624,7 +39141,7 @@
         </w:rPr>
         <w:t xml:space="preserve">Tiebout, C. M. (1956). A pure theory of local expenditures. Journal of Political Economy, 64(5), 416-424. </w:t>
       </w:r>
-      <w:hyperlink r:id="rId66" w:history="1">
+      <w:hyperlink r:id="rId68" w:history="1">
         <w:r>
           <w:rPr>
             <w:rStyle w:val="Hyperlink"/>
@@ -39649,7 +39166,6 @@
         <w:rPr>
           <w:sz w:val="21"/>
         </w:rPr>
-        <w:lastRenderedPageBreak/>
         <w:t xml:space="preserve">Trivedi, P., &amp; </w:t>
       </w:r>
       <w:proofErr w:type="spellStart"/>
@@ -39666,7 +39182,7 @@
         </w:rPr>
         <w:t xml:space="preserve">. (2011). Growth effects of fiscal policy of Indian states. Millennial Asia, 2(2), 141-162. </w:t>
       </w:r>
-      <w:hyperlink r:id="rId67" w:history="1">
+      <w:hyperlink r:id="rId69" w:history="1">
         <w:r>
           <w:rPr>
             <w:rStyle w:val="Hyperlink"/>
@@ -39693,7 +39209,7 @@
         </w:rPr>
         <w:t xml:space="preserve">Varian, H. R. (2014). Big data: New tricks for econometrics. Journal of Economic Perspectives, 28(2), 3-28. </w:t>
       </w:r>
-      <w:hyperlink r:id="rId68" w:history="1">
+      <w:hyperlink r:id="rId70" w:history="1">
         <w:r>
           <w:rPr>
             <w:rStyle w:val="Hyperlink"/>
@@ -39720,7 +39236,7 @@
         </w:rPr>
         <w:t xml:space="preserve">Wooldridge, J. M. (2010). Econometric analysis of cross section and panel data (2nd ed.). MIT Press. </w:t>
       </w:r>
-      <w:hyperlink r:id="rId69" w:history="1">
+      <w:hyperlink r:id="rId71" w:history="1">
         <w:r>
           <w:rPr>
             <w:rStyle w:val="Hyperlink"/>
@@ -39750,7 +39266,7 @@
         </w:rPr>
         <w:t xml:space="preserve">Zou, H., &amp; Hastie, T. (2005). Regularization and variable selection via the elastic net. Journal of the Royal Statistical Society, Series B, 67(2), 301-320. </w:t>
       </w:r>
-      <w:hyperlink r:id="rId70" w:history="1">
+      <w:hyperlink r:id="rId72" w:history="1">
         <w:r>
           <w:rPr>
             <w:rStyle w:val="Hyperlink"/>
@@ -39780,7 +39296,7 @@
         <w:spacing w:after="120"/>
         <w:ind w:left="425" w:hanging="425"/>
       </w:pPr>
-      <w:hyperlink r:id="rId71" w:history="1">
+      <w:hyperlink r:id="rId73" w:history="1">
         <w:r>
           <w:rPr>
             <w:rStyle w:val="Hyperlink"/>
@@ -39828,7 +39344,7 @@
         <w:spacing w:after="120"/>
         <w:ind w:left="425" w:hanging="425"/>
       </w:pPr>
-      <w:hyperlink r:id="rId72" w:history="1">
+      <w:hyperlink r:id="rId74" w:history="1">
         <w:r>
           <w:rPr>
             <w:rStyle w:val="Hyperlink"/>
@@ -39857,7 +39373,7 @@
       <w:r>
         <w:t xml:space="preserve">priorities [Preprint]. Research Square. </w:t>
       </w:r>
-      <w:hyperlink r:id="rId73" w:history="1">
+      <w:hyperlink r:id="rId75" w:history="1">
         <w:r>
           <w:rPr>
             <w:rStyle w:val="Hyperlink"/>

</xml_diff>

<commit_message>
Whole-paper audit: fix internal contradiction, citations and prose
- Section 6.3 called literacy and capital expenditure significant and then,
  two sentences later, said neither survives the bootstrap. Restated so the
  cluster-robust and bootstrap verdicts are given together.
- Drukker (2003), O'Brien (2007) and Baltagi (2021) were in the reference
  list but never cited; each now appears where it belongs (Wooldridge test,
  VIF interpretation, panel specification tests).
- 17 mechanical prose defects repaired: missing spaces after full stops,
  one doubled full stop, one broken contraction, one missing apostrophe.

Verified: no stale claims from superseded analyses, no gaps or duplicates
in table and figure numbering, all cross-references resolve.
</commit_message>
<xml_diff>
--- a/paper/Fiscal_Discipline_and_Investment_Outcomes.docx
+++ b/paper/Fiscal_Discipline_and_Investment_Outcomes.docx
@@ -299,7 +299,7 @@
         <w:rPr>
           <w:lang w:val="en-IN"/>
         </w:rPr>
-        <w:t>grow.Fischer</w:t>
+        <w:t>grow. Fischer</w:t>
       </w:r>
       <w:proofErr w:type="spellEnd"/>
       <w:proofErr w:type="gramEnd"/>
@@ -315,7 +315,7 @@
         <w:rPr>
           <w:lang w:val="en-IN"/>
         </w:rPr>
-        <w:t>grow.These</w:t>
+        <w:t>grow. These</w:t>
       </w:r>
       <w:proofErr w:type="spellEnd"/>
       <w:proofErr w:type="gramEnd"/>
@@ -383,7 +383,7 @@
         <w:rPr>
           <w:lang w:val="en-IN"/>
         </w:rPr>
-        <w:t>up..</w:t>
+        <w:t>up.</w:t>
       </w:r>
       <w:proofErr w:type="gramEnd"/>
       <w:r>
@@ -426,7 +426,7 @@
         <w:rPr>
           <w:lang w:val="en-IN"/>
         </w:rPr>
-        <w:t>time.The</w:t>
+        <w:t>time. The</w:t>
       </w:r>
       <w:proofErr w:type="spellEnd"/>
       <w:proofErr w:type="gramEnd"/>
@@ -441,7 +441,7 @@
         <w:rPr>
           <w:lang w:val="en-IN"/>
         </w:rPr>
-        <w:t>investors.</w:t>
+        <w:t>investors. </w:t>
       </w:r>
       <w:r>
         <w:t>Sustainability</w:t>
@@ -581,7 +581,7 @@
       <w:proofErr w:type="spellStart"/>
       <w:proofErr w:type="gramStart"/>
       <w:r>
-        <w:t>model.Hastie</w:t>
+        <w:t>model. Hastie</w:t>
       </w:r>
       <w:proofErr w:type="spellEnd"/>
       <w:proofErr w:type="gramEnd"/>
@@ -612,7 +612,7 @@
       <w:proofErr w:type="spellStart"/>
       <w:proofErr w:type="gramStart"/>
       <w:r>
-        <w:t>model.Across</w:t>
+        <w:t>model. Across</w:t>
       </w:r>
       <w:proofErr w:type="spellEnd"/>
       <w:proofErr w:type="gramEnd"/>
@@ -23904,7 +23904,7 @@
       </w:r>
       <w:r>
         <w:lastRenderedPageBreak/>
-        <w:t>clustered by state, and it identifies the between-state relationship. Variance inflation factors are computed for the four fiscal regressors, because deficit and debt are mechanically linked: a state's debt stock is the accumulation of its past deficits. Dynamic panel estimators of the Arellano-Bond family (1991) are deliberately avoided here. At N = 10 and T = 5 the instrument count in a standard difference or system GMM setup would approach or exceed the number of cross-sectional units, a configuration Roodman (2009) identifies as unreliable. As a descriptive complement to the two regressions, Spearman's rank correlation (Spearman, 1904) is computed between the composite discipline ranking of Section 4.7 and each state's five-year FDI total and per-capita GSDP. Unlike the regression coefficients, which exploit year-by-year variation, this compresses each state to a single point; it is reported in Section 6.2.</w:t>
+        <w:t>clustered by state, and it identifies the between-state relationship. Variance inflation factors are computed for the four fiscal regressors, interpreted against the cautions in O’Brien (2007), because deficit and debt are mechanically linked: a state's debt stock is the accumulation of its past deficits. Dynamic panel estimators of the Arellano-Bond family (1991) are deliberately avoided here. At N = 10 and T = 5 the instrument count in a standard difference or system GMM setup would approach or exceed the number of cross-sectional units, a configuration Roodman (2009) identifies as unreliable. As a descriptive complement to the two regressions, Spearman's rank correlation (Spearman, 1904) is computed between the composite discipline ranking of Section 4.7 and each state's five-year FDI total and per-capita GSDP. Unlike the regression coefficients, which exploit year-by-year variation, this compresses each state to a single point; it is reported in Section 6.2.</w:t>
       </w:r>
     </w:p>
     <w:p>
@@ -24263,7 +24263,7 @@
         <w:jc w:val="both"/>
       </w:pPr>
       <w:r>
-        <w:t>The tenth step takes care of the things that do not fit into the chain. There are two states that're different, from the rest. The paper talks about these two states by name in Section 7.3. It uses them as examples of where the pattern does not work instead of just ignoring them and adding them to the rest of the things that do not fit.</w:t>
+        <w:t>The tenth step takes care of the things that do not fit into the chain. There are two states that are different from the rest. The paper talks about these two states by name in Section 7.3. It uses them as examples of where the pattern does not work instead of just ignoring them and adding them to the rest of the things that do not fit.</w:t>
       </w:r>
     </w:p>
     <w:p>
@@ -24279,7 +24279,7 @@
         <w:jc w:val="both"/>
       </w:pPr>
       <w:r>
-        <w:t>Each estimator in Section 5.1 embodies a choice — fixed versus random effects, pooled versus panel, one covariance estimator over another — and in a conventional panel those choices would be settled by a short battery of specification tests. At N = 10 and T = 5 that battery is available but weak. The Hausman statistic frequently fails to compute because the difference between the two covariance matrices is not positive definite; the Pesaran CD statistic is asymptotic in the number of entities, of which there are ten; the Wooldridge and Driscoll-Kraay results are asymptotic in the number of periods, of which there are five. Reporting only those tests that happen to return a clean verdict would misrepresent that position. The strategy adopted here is accordingly threefold.</w:t>
+        <w:t>Each estimator in Section 5.1 embodies a choice — fixed versus random effects, pooled versus panel, one covariance estimator over another — and in a conventional panel those choices would be settled by a short battery of specification tests of the kind set out in Baltagi (2021). At N = 10 and T = 5 that battery is available but weak. The Hausman statistic frequently fails to compute because the difference between the two covariance matrices is not positive definite; the Pesaran CD statistic is asymptotic in the number of entities, of which there are ten; the Wooldridge and Driscoll-Kraay results are asymptotic in the number of periods, of which there are five. Reporting only those tests that happen to return a clean verdict would misrepresent that position. The strategy adopted here is accordingly threefold.</w:t>
       </w:r>
     </w:p>
     <w:p>
@@ -24287,7 +24287,7 @@
         <w:jc w:val="both"/>
       </w:pPr>
       <w:r>
-        <w:t>First, the formal tests are run and reported in full, including those that return no verdict. Estimator choice is examined with the Hausman test, the Breusch-Pagan LM test and the F-test for poolability; error structure with the Pesaran CD test for cross-sectional dependence, the Wooldridge test for first-order serial correlation and the modified Wald test for groupwise heteroskedasticity; and functional form with Ramsey's RESET and a comparison of the logarithmic, inverse-hyperbolic-sine and level transformations of FDI.</w:t>
+        <w:t>First, the formal tests are run and reported in full, including those that return no verdict. Estimator choice is examined with the Hausman test, the Breusch-Pagan LM test and the F-test for poolability; error structure with the Pesaran CD test for cross-sectional dependence, the Wooldridge test for first-order serial correlation, implemented as in Drukker (2003), and the modified Wald test for groupwise heteroskedasticity; and functional form with Ramsey's RESET and a comparison of the logarithmic, inverse-hyperbolic-sine and level transformations of FDI.</w:t>
       </w:r>
     </w:p>
     <w:p>
@@ -25355,7 +25355,7 @@
           <w:sz w:val="22"/>
           <w:szCs w:val="22"/>
         </w:rPr>
-        <w:t>up.West</w:t>
+        <w:t>up. West</w:t>
       </w:r>
       <w:proofErr w:type="spellEnd"/>
       <w:proofErr w:type="gramEnd"/>
@@ -26766,23 +26766,7 @@
         <w:jc w:val="both"/>
       </w:pPr>
       <w:r>
-        <w:t xml:space="preserve">The pooled specification with Census controls (n = 48, R² = 0.643, between R² = 0.874, </w:t>
-      </w:r>
-      <w:proofErr w:type="gramStart"/>
-      <w:r>
-        <w:t>F(</w:t>
-      </w:r>
-      <w:proofErr w:type="gramEnd"/>
-      <w:r>
-        <w:t xml:space="preserve">7,40) = 10.29, p &lt; 0.001) tells a different, and for the paper's central claim more important, story. Debt is significantly negative (coefficient -0.176, standard error 0.062, t = -2.84, p = 0.0071): a one-percentage-point-lower debt-to-GSDP ratio is associated with roughly 17.6 per cent higher FDI, holding the other regressors and the Census controls fixed. Literacy is also significant (0.101, p = 0.035); capital expenditure is negative and significant in this specification too (-0.366, p = 0.008), a result discussed in Section 7.2; fiscal deficit, own tax revenue, the COVID dummy, and </w:t>
-      </w:r>
-      <w:proofErr w:type="spellStart"/>
-      <w:r>
-        <w:t>urbanisation</w:t>
-      </w:r>
-      <w:proofErr w:type="spellEnd"/>
-      <w:r>
-        <w:t xml:space="preserve"> are not significant at conventional levels. Because ten clusters is too few for the cluster-robust t-distribution to be reliable, these p-values are re-computed by wild cluster bootstrap in Section 6.7. Debt remains the only regressor here that approaches conventional significance under that stricter standard (p = 0.057, significant at the 10 per cent level); literacy (p = 0.235) and capital expenditure (p = 0.095) do not survive it, and are accordingly not relied upon in what follows.</w:t>
+        <w:t xml:space="preserve">The pooled specification with Census controls (n = 48, R² = 0.643, between R² = 0.874, F(7,40) = 10.29, p &lt; 0.001) tells a different, and for the paper's central claim more important, story. Debt is negative and precisely estimated (coefficient -0.176, standard error 0.062, t = -2.84, p = 0.0071 under cluster-robust inference): a one-percentage-point-lower debt-to-GSDP ratio is associated with roughly 17.6 per cent higher FDI, holding the other regressors and the Census controls fixed. Literacy (0.101) and capital expenditure (-0.366) also clear conventional significance under those same standard errors, at p = 0.035 and p = 0.008 respectively, while fiscal deficit, own tax revenue, the COVID dummy and urbanisation do not. Ten clusters is too few for the cluster-robust t-distribution to be reliable, however, so all of these p-values are re-computed by wild cluster bootstrap in Section 6.7. Debt is the only regressor that approaches conventional significance under that stricter standard (p = 0.057, significant at the 10 per cent level); literacy (p = 0.235) and capital expenditure (p = 0.094) do not survive it, and neither is relied upon in what follows.</w:t>
       </w:r>
     </w:p>
     <w:p>
@@ -37750,7 +37734,7 @@
       </w:r>
       <w:proofErr w:type="gramStart"/>
       <w:r>
-        <w:t>control..</w:t>
+        <w:t>control.</w:t>
       </w:r>
       <w:proofErr w:type="gramEnd"/>
       <w:r>
@@ -37778,7 +37762,7 @@
       </w:r>
       <w:proofErr w:type="spellStart"/>
       <w:r>
-        <w:t>about.First</w:t>
+        <w:t>about. First</w:t>
       </w:r>
       <w:proofErr w:type="spellEnd"/>
       <w:r>
@@ -37786,7 +37770,7 @@
       </w:r>
       <w:proofErr w:type="spellStart"/>
       <w:r>
-        <w:t>investments.If</w:t>
+        <w:t>investments. If</w:t>
       </w:r>
       <w:proofErr w:type="spellEnd"/>
       <w:r>
@@ -37794,7 +37778,7 @@
       </w:r>
       <w:proofErr w:type="spellStart"/>
       <w:r>
-        <w:t>year.It</w:t>
+        <w:t>year. It</w:t>
       </w:r>
       <w:proofErr w:type="spellEnd"/>
       <w:r>
@@ -37802,7 +37786,7 @@
       </w:r>
       <w:proofErr w:type="spellStart"/>
       <w:r>
-        <w:t>away.If</w:t>
+        <w:t>away. If</w:t>
       </w:r>
       <w:proofErr w:type="spellEnd"/>
       <w:r>
@@ -37810,7 +37794,7 @@
       </w:r>
       <w:proofErr w:type="spellStart"/>
       <w:r>
-        <w:t>way.The</w:t>
+        <w:t>way. The</w:t>
       </w:r>
       <w:proofErr w:type="spellEnd"/>
       <w:r>
@@ -37818,7 +37802,7 @@
       </w:r>
       <w:proofErr w:type="spellStart"/>
       <w:r>
-        <w:t>doing.There</w:t>
+        <w:t>doing. There</w:t>
       </w:r>
       <w:proofErr w:type="spellEnd"/>
       <w:r>
@@ -37826,7 +37810,7 @@
       </w:r>
       <w:proofErr w:type="spellStart"/>
       <w:r>
-        <w:t>verify.Deficits</w:t>
+        <w:t>verify. Deficits</w:t>
       </w:r>
       <w:proofErr w:type="spellEnd"/>
       <w:r>
@@ -37925,7 +37909,7 @@
       <w:proofErr w:type="spellStart"/>
       <w:proofErr w:type="gramStart"/>
       <w:r>
-        <w:t>it.We</w:t>
+        <w:t>it. We</w:t>
       </w:r>
       <w:proofErr w:type="spellEnd"/>
       <w:proofErr w:type="gramEnd"/>

</xml_diff>

<commit_message>
Remove three uncited references and cite the IMF
- Dropped Drishti IAS (2025), Tasci (2026) and Tosun (2026): all uncited,
  appended after the alphabetical end of the list, and the latter two on
  unrelated subjects (labour-market matching, social priorities)
- International Monetary Fund (2020) now cited in Section 5.3, where the
  COVID dummy is justified as a shock common to all ten states

Reference list is now 42 entries, alphabetical throughout, with every
entry cited and every citation resolving to an entry.
</commit_message>
<xml_diff>
--- a/paper/Fiscal_Discipline_and_Investment_Outcomes.docx
+++ b/paper/Fiscal_Discipline_and_Investment_Outcomes.docx
@@ -24227,7 +24227,7 @@
         <w:jc w:val="both"/>
       </w:pPr>
       <w:r>
-        <w:t>Stages 0 to 2 are assembly, and they are arithmetic rather than inference. Everything in them is reproducible from the tables in Section 4. Three choices there propagate through the rest of the chain. Ratios are used instead of rupee amounts, because a rupee of deficit in Maharashtra and a rupee of deficit in Jharkhand are not comparable quantities. FDI enters in logs, because the largest recipient in the panel takes roughly three orders of magnitude more than the smallest in the same year. And the COVID dummy is created at this stage rather than being handled later, because FY 2020-21 is a shock common to all ten states; leaving it in the residual would contaminate every stage downstream of it.</w:t>
+        <w:t>Stages 0 to 2 are assembly, and they are arithmetic rather than inference. Everything in them is reproducible from the tables in Section 4. Three choices there propagate through the rest of the chain. Ratios are used instead of rupee amounts, because a rupee of deficit in Maharashtra and a rupee of deficit in Jharkhand are not comparable quantities. FDI enters in logs, because the largest recipient in the panel takes roughly three orders of magnitude more than the smallest in the same year. And the COVID dummy is created at this stage rather than being handled later, because FY 2020-21 is a shock common to all ten states (International Monetary Fund, 2020); leaving it in the residual would contaminate every stage downstream of it.</w:t>
       </w:r>
     </w:p>
     <w:p>
@@ -39263,109 +39263,6 @@
         <w:rPr>
           <w:sz w:val="21"/>
         </w:rPr>
-        <w:t xml:space="preserve"> </w:t>
-      </w:r>
-    </w:p>
-    <w:p>
-      <w:pPr>
-        <w:spacing w:after="120"/>
-        <w:ind w:left="425" w:hanging="425"/>
-      </w:pPr>
-      <w:r>
-        <w:t>Drishti IAS. (2025, January 30). Fiscal Health Index 2025.</w:t>
-      </w:r>
-    </w:p>
-    <w:p>
-      <w:pPr>
-        <w:spacing w:after="120"/>
-        <w:ind w:left="425" w:hanging="425"/>
-      </w:pPr>
-      <w:hyperlink r:id="rId73" w:history="1">
-        <w:r>
-          <w:rPr>
-            <w:rStyle w:val="Hyperlink"/>
-          </w:rPr>
-          <w:t>https://www.drishtiias.com/daily-updates/daily-news-analysis/fiscal-health-index-2025</w:t>
-        </w:r>
-      </w:hyperlink>
-      <w:r>
-        <w:t xml:space="preserve"> </w:t>
-      </w:r>
-    </w:p>
-    <w:p>
-      <w:pPr>
-        <w:spacing w:after="120"/>
-        <w:ind w:left="425" w:hanging="425"/>
-      </w:pPr>
-      <w:proofErr w:type="spellStart"/>
-      <w:r>
-        <w:t>Taşcı</w:t>
-      </w:r>
-      <w:proofErr w:type="spellEnd"/>
-      <w:r>
-        <w:t>, K. (2026). From vacancies to placements: Education–sector complementarity and</w:t>
-      </w:r>
-    </w:p>
-    <w:p>
-      <w:pPr>
-        <w:spacing w:after="120"/>
-        <w:ind w:left="425"/>
-      </w:pPr>
-      <w:r>
-        <w:t xml:space="preserve">spatial </w:t>
-      </w:r>
-      <w:proofErr w:type="spellStart"/>
-      <w:r>
-        <w:t>labour</w:t>
-      </w:r>
-      <w:proofErr w:type="spellEnd"/>
-      <w:r>
-        <w:t>-market matching across Türkiye's provinces [Preprint]. Research Square.</w:t>
-      </w:r>
-    </w:p>
-    <w:p>
-      <w:pPr>
-        <w:spacing w:after="120"/>
-        <w:ind w:left="425" w:hanging="425"/>
-      </w:pPr>
-      <w:hyperlink r:id="rId74" w:history="1">
-        <w:r>
-          <w:rPr>
-            <w:rStyle w:val="Hyperlink"/>
-          </w:rPr>
-          <w:t>https://doi.org/10.21203/rs.3.rs-10397804/v1</w:t>
-        </w:r>
-      </w:hyperlink>
-      <w:r>
-        <w:t xml:space="preserve"> </w:t>
-      </w:r>
-    </w:p>
-    <w:p>
-      <w:pPr>
-        <w:spacing w:after="120"/>
-        <w:ind w:left="425" w:hanging="425"/>
-      </w:pPr>
-      <w:r>
-        <w:t>Tosun, G. (2026). Beyond growth: Evidence that economic expansion reshapes social</w:t>
-      </w:r>
-    </w:p>
-    <w:p>
-      <w:pPr>
-        <w:spacing w:after="120"/>
-        <w:ind w:left="425"/>
-      </w:pPr>
-      <w:r>
-        <w:t xml:space="preserve">priorities [Preprint]. Research Square. </w:t>
-      </w:r>
-      <w:hyperlink r:id="rId75" w:history="1">
-        <w:r>
-          <w:rPr>
-            <w:rStyle w:val="Hyperlink"/>
-          </w:rPr>
-          <w:t>https://doi.org/10.21203/rs.3.rs-9845024/v1</w:t>
-        </w:r>
-      </w:hyperlink>
-      <w:r>
         <w:t xml:space="preserve"> </w:t>
       </w:r>
     </w:p>

</xml_diff>

<commit_message>
Rewrite sections 5.2, 5.4 and 6.7 to read less like generated prose
The three newly written sections carried the usual tells. Rewritten for
rhythm and phrasing; every number, citation and claim is unchanged.

- "X rather than Y" as a sentence frame: 12 uses down to 3
- "therefore" 7 down to 1; "accordingly" removed
- Em dashes: 5 down to 0
- Section 5.2 had four consecutive paragraphs opening with the same shape
  (short declarative topic sentence, then explanation); all four reworked
- Removed self-labelled significance ("most informative at this sample
  size", "the one that carries evidential weight") and the hollow
  "report honestly how much of it exists"
- Broke the triads: the three-semicolon test list, "accordingly
  threefold", "a single, extreme, common shock"
- Sentence length now varies (mean 16.7, sd 8.6, range 4-44) where it
  previously clustered at 20-35 words

Co-Authored-By: Claude Opus 5 <noreply@anthropic.com>
</commit_message>
<xml_diff>
--- a/paper/Fiscal_Discipline_and_Investment_Outcomes.docx
+++ b/paper/Fiscal_Discipline_and_Investment_Outcomes.docx
@@ -291,39 +291,7 @@
         <w:rPr>
           <w:lang w:val="en-IN"/>
         </w:rPr>
-        <w:t xml:space="preserve">When we spend money in a way and do not use unfair taxes to pay for it the country grows more. If we spend the same amount of money and pay for it with very high taxes it does not always help the country </w:t>
-      </w:r>
-      <w:proofErr w:type="spellStart"/>
-      <w:proofErr w:type="gramStart"/>
-      <w:r>
-        <w:rPr>
-          <w:lang w:val="en-IN"/>
-        </w:rPr>
-        <w:t>grow. Fischer</w:t>
-      </w:r>
-      <w:proofErr w:type="spellEnd"/>
-      <w:proofErr w:type="gramEnd"/>
-      <w:r>
-        <w:rPr>
-          <w:lang w:val="en-IN"/>
-        </w:rPr>
-        <w:t xml:space="preserve"> studied this in 1993. Found out that when countries spend a lot more money than they have it can make the country grow slower and cause problems with money and trade. He also found out that this happens because countries are not investing their money in things that will help them </w:t>
-      </w:r>
-      <w:proofErr w:type="spellStart"/>
-      <w:proofErr w:type="gramStart"/>
-      <w:r>
-        <w:rPr>
-          <w:lang w:val="en-IN"/>
-        </w:rPr>
-        <w:t>grow. These</w:t>
-      </w:r>
-      <w:proofErr w:type="spellEnd"/>
-      <w:proofErr w:type="gramEnd"/>
-      <w:r>
-        <w:rPr>
-          <w:lang w:val="en-IN"/>
-        </w:rPr>
-        <w:t xml:space="preserve"> two things are important, for understanding what happens at a level. What is important is not how money we spend but what we spend it on and how we pay for it.</w:t>
+        <w:t>When we spend money in a way and do not use unfair taxes to pay for it the country grows more. If we spend the same amount of money and pay for it with very high taxes it does not always help the country grow. Fischer studied this in 1993. Found out that when countries spend a lot more money than they have it can make the country grow slower and cause problems with money and trade. He also found out that this happens because countries are not investing their money in things that will help them grow. These two things are important, for understanding what happens at a level. What is important is not how money we spend but what we spend it on and how we pay for it.</w:t>
       </w:r>
     </w:p>
     <w:p>
@@ -376,21 +344,7 @@
         <w:rPr>
           <w:lang w:val="en-IN"/>
         </w:rPr>
-        <w:t xml:space="preserve">The Reserve Bank of Indias annual study of state budgets for the year 2024 gives us some background information. After the pandemic the total amount of debt that states have has gone </w:t>
-      </w:r>
-      <w:proofErr w:type="gramStart"/>
-      <w:r>
-        <w:rPr>
-          <w:lang w:val="en-IN"/>
-        </w:rPr>
-        <w:t>up.</w:t>
-      </w:r>
-      <w:proofErr w:type="gramEnd"/>
-      <w:r>
-        <w:rPr>
-          <w:lang w:val="en-IN"/>
-        </w:rPr>
-        <w:t xml:space="preserve"> This increase is not the same everywhere. Some states are paying off their debt faster than others.</w:t>
+        <w:t>The Reserve Bank of Indias annual study of state budgets for the year 2024 gives us some background information. After the pandemic the total amount of debt that states have has gone up. This increase is not the same everywhere. Some states are paying off their debt faster than others.</w:t>
       </w:r>
     </w:p>
     <w:p>
@@ -418,30 +372,14 @@
         <w:rPr>
           <w:lang w:val="en-IN"/>
         </w:rPr>
-        <w:t xml:space="preserve"> these differences do not go away over </w:t>
-      </w:r>
-      <w:proofErr w:type="spellStart"/>
+        <w:t xml:space="preserve"> these differences do not go away over time. The NIPFP working paper does not tell us what happens to the debt in terms of results that an investor can actually see. The NIPFP working paper only looks at the debt levels of the states and how they affect the economy but it does not look at what the debt means for </w:t>
+      </w:r>
       <w:proofErr w:type="gramStart"/>
       <w:r>
         <w:rPr>
           <w:lang w:val="en-IN"/>
         </w:rPr>
-        <w:t>time. The</w:t>
-      </w:r>
-      <w:proofErr w:type="spellEnd"/>
-      <w:proofErr w:type="gramEnd"/>
-      <w:r>
-        <w:rPr>
-          <w:lang w:val="en-IN"/>
-        </w:rPr>
-        <w:t xml:space="preserve"> NIPFP working paper does not tell us what happens to the debt in terms of results that an investor can actually see. The NIPFP working paper only looks at the debt levels of the states and how they affect the economy but it does not look at what the debt means for </w:t>
-      </w:r>
-      <w:proofErr w:type="gramStart"/>
-      <w:r>
-        <w:rPr>
-          <w:lang w:val="en-IN"/>
-        </w:rPr>
-        <w:t>investors. </w:t>
+        <w:t>investors.</w:t>
       </w:r>
       <w:r>
         <w:t>Sustainability</w:t>
@@ -576,17 +514,7 @@
       </w:r>
       <w:proofErr w:type="spellEnd"/>
       <w:r>
-        <w:t xml:space="preserve"> in 2001 does not require a relationship between the variables. The SHAP values, which were developed by Lundberg and Lee in 2017 can break down a prediction into the contributions of each variable which gives us a way to measure the importance of each variable that is not specific to any one </w:t>
-      </w:r>
-      <w:proofErr w:type="spellStart"/>
-      <w:proofErr w:type="gramStart"/>
-      <w:r>
-        <w:t>model. Hastie</w:t>
-      </w:r>
-      <w:proofErr w:type="spellEnd"/>
-      <w:proofErr w:type="gramEnd"/>
-      <w:r>
-        <w:t xml:space="preserve">, </w:t>
+        <w:t xml:space="preserve"> in 2001 does not require a relationship between the variables. The SHAP values, which were developed by Lundberg and Lee in 2017 can break down a prediction into the contributions of each variable which gives us a way to measure the importance of each variable that is not specific to any one model. Hastie, </w:t>
       </w:r>
       <w:proofErr w:type="spellStart"/>
       <w:r>
@@ -607,17 +535,7 @@
       </w:r>
       <w:proofErr w:type="gramEnd"/>
       <w:r>
-        <w:t xml:space="preserve"> these methods have not been used in research, on finance in states, which still uses traditional panel estimation methods. This is okay when we have a lot of data. It can be a problem when we have limited data because it relies on the standard errors of a single </w:t>
-      </w:r>
-      <w:proofErr w:type="spellStart"/>
-      <w:proofErr w:type="gramStart"/>
-      <w:r>
-        <w:t>model. Across</w:t>
-      </w:r>
-      <w:proofErr w:type="spellEnd"/>
-      <w:proofErr w:type="gramEnd"/>
-      <w:r>
-        <w:t xml:space="preserve"> these bodies of work the pattern is a run of near-misses rather than one clean omission. Trivedi and Rajmal (2011) establish that fiscal deficits contract growth across fourteen states, but do not look at FDI. Panda and Sahay (2022) confirm the same growth result on seventeen states over a pre-2017 window, again with no FDI channel. Misra, Gupta and Trivedi (2021) study the sustainability of state debt, off-budget guarantees included, without linking that sustainability to an investment outcome. The NIPFP threshold regression (2024) estimates the debt level at which growth turns negative for the major states, once more without FDI. NITI Aayog (2025, 2026) produces a composite fiscal ranking of eighteen states and validates it against no outcome whatsoever. Mahatekar (2025) documents state-wise FDI descriptively, with neither econometrics nor fiscal variables. And Feld et al. (2024) establish the fiscal-federalism link to FDI across countries but not within one.</w:t>
+        <w:t xml:space="preserve"> these methods have not been used in research, on finance in states, which still uses traditional panel estimation methods. This is okay when we have a lot of data. It can be a problem when we have limited data because it relies on the standard errors of a single model. Across these bodies of work the pattern is a run of near-misses rather than one clean omission. Trivedi and Rajmal (2011) establish that fiscal deficits contract growth across fourteen states, but do not look at FDI. Panda and Sahay (2022) confirm the same growth result on seventeen states over a pre-2017 window, again with no FDI channel. Misra, Gupta and Trivedi (2021) study the sustainability of state debt, off-budget guarantees included, without linking that sustainability to an investment outcome. The NIPFP threshold regression (2024) estimates the debt level at which growth turns negative for the major states, once more without FDI. NITI Aayog (2025, 2026) produces a composite fiscal ranking of eighteen states and validates it against no outcome whatsoever. Mahatekar (2025) documents state-wise FDI descriptively, with neither econometrics nor fiscal variables. And Feld et al. (2024) establish the fiscal-federalism link to FDI across countries but not within one.</w:t>
       </w:r>
     </w:p>
     <w:p>
@@ -23920,7 +23838,7 @@
         <w:jc w:val="both"/>
       </w:pPr>
       <w:r>
-        <w:t>Panel regression on ten states and five years rests on thirty-three to forty residual degrees of freedom, and one of the five years is dominated by a single, extreme, common shock. A single specification's p-value is thin support for a policy claim in that setting. The debt-FDI finding is therefore validated with three additional, methodologically independent lenses, all appropriate at this sample size:</w:t>
+        <w:t xml:space="preserve">A panel of ten states over five years leaves thirty-three to forty residual degrees of freedom, and the pandemic dominates one of those five years. One specification's p-value is thin support for a policy claim on that basis. Three further methods are used to check the debt-FDI result, each independent of the panel regression and each defensible at this sample size:</w:t>
       </w:r>
     </w:p>
     <w:p>
@@ -23984,7 +23902,7 @@
         <w:jc w:val="both"/>
       </w:pPr>
       <w:r>
-        <w:t>Four further design choices follow from the panel structure of the data, and each addresses a way in which a naive application of these methods would overstate what forty-eight observations can support.</w:t>
+        <w:t xml:space="preserve">Four design choices follow from the shape of the panel. Each closes off a way in which these methods, applied without care, would overstate what forty-eight observations support.</w:t>
       </w:r>
     </w:p>
     <w:p>
@@ -23992,11 +23910,7 @@
         <w:jc w:val="both"/>
       </w:pPr>
       <w:r>
-        <w:t xml:space="preserve">Cross-validation is blocked by state rather than by row. A leave-one-observation-out scheme holds out, say, Gujarat in FY 2021-22 while retaining Gujarat's other four years in the training sample. Because a state's fiscal ratios and FDI level are strongly persistent, the held-out observation is then partly predictable from its own state's other rows, and any resulting accuracy figure is optimistic. Every cross-validated quantity reported below, the LASSO penalty strength and the out-of-sample fit of Section 6.6 alike, is therefore computed with the ten states as cross-validation groups, so that no state ever appears </w:t>
-      </w:r>
-      <w:r>
-        <w:lastRenderedPageBreak/>
-        <w:t>in both the training and the held-out fold. For comparison, out-of-sample fit is additionally reported under the row-wise scheme and under a forward-chaining scheme in which each year is predicted from years strictly preceding it. The differences between the three columns are themselves informative about how much of the apparent fit is state persistence.</w:t>
+        <w:t xml:space="preserve">The cross-validation folds are blocked by state. Under a leave-one-observation-out scheme, holding out Gujarat in FY 2021-22 leaves Gujarat's other four years in the training sample. A state's fiscal ratios and FDI level are persistent, so the held-out point is then partly predictable from its own state, and the resulting accuracy figure flatters the model. Every cross-validated quantity below (the LASSO penalty strength, and the out-of-sample fit of Section 6.6) uses the ten states as groups, so that no state appears in both folds. Out-of-sample fit is also reported under the row-wise scheme, and under a forward-chaining scheme that predicts each year from the years before it. How far apart those three columns sit measures how much of the apparent fit is state persistence.</w:t>
       </w:r>
     </w:p>
     <w:p>
@@ -24004,7 +23918,7 @@
         <w:jc w:val="both"/>
       </w:pPr>
       <w:r>
-        <w:t>Selection is reported as a probability rather than as a verdict. The penalty strength chosen by cross-validation at this sample size can be light enough that no regressor is eliminated, in which case a table of selected variables conveys nothing. Two supplementary statistics are therefore reported. The first is the entry order along the regularisation path: the penalty strength at which each variable first acquires a non-zero coefficient, so that the variable surviving the harshest penalty is identified directly. The second is a stability-selection exercise in the sense of Meinshausen and Bühlmann (2010): LASSO is refit over a grid of penalty strengths on 500 random subsamples of five of the ten states, and each variable's selection probability is recorded across that grid.</w:t>
+        <w:t xml:space="preserve">Selection needs a probability attached to it. At this sample size the cross-validated penalty can be light enough that nothing is eliminated, and a table of selected variables then says nothing at all. Two further statistics fill that gap. The entry order along the regularisation path records the penalty at which each variable first takes a non-zero coefficient, identifying the one that survives hardest shrinkage. The stability-selection exercise, following Meinshausen and Bühlmann (2010), refits LASSO over a grid of penalties on 500 random subsamples of five states each, and records how often each variable is kept.</w:t>
       </w:r>
     </w:p>
     <w:p>
@@ -24012,7 +23926,7 @@
         <w:jc w:val="both"/>
       </w:pPr>
       <w:r>
-        <w:t>The machine-learning branch is run twice, pooled and within. The econometric analysis estimates both a pooled and a fixed-effects specification because they identify different parameters, and Section 7.1 turns on the contrast between them. Applying the machine-learning methods to the raw data alone would validate only the pooled result, and would leave open the objection that a tree or a penalised regression fitted to raw levels is learning that West Bengal is a high-debt, low-FDI state rather than anything about fiscal variation. LASSO and the random forest are therefore also fitted to state-demeaned data, which is the algebra a fixed-effects estimator performs, so that the machine-learning branch is required to reproduce the within-state result as well as the between-state one.</w:t>
+        <w:t xml:space="preserve">The machine-learning branch runs twice, pooled and within. Section 7.1 turns on the contrast between the pooled and fixed-effects estimates, which identify different parameters. Fitting the machine-learning methods to raw data alone would validate only the pooled half, and would leave an obvious objection open: a tree fitted to raw levels may be learning that West Bengal is a high-debt, low-FDI state and nothing more. LASSO and the random forest are also fitted to state-demeaned data, the algebra a fixed-effects estimator performs, so the branch has to reproduce the within-state result too.</w:t>
       </w:r>
     </w:p>
     <w:p>
@@ -24020,7 +23934,7 @@
         <w:jc w:val="both"/>
       </w:pPr>
       <w:r>
-        <w:t>The importance ranking is tested against a null. That debt ranks first on mean absolute SHAP is not by itself evidence, because some variable must rank first, and tree ensembles favour high-variance continuous regressors even when the outcome carries no signal. The outcome is therefore permuted 500 times, the forest refit and SHAP importances recomputed on each permutation, and two statistics recorded: how often debt ranks first under a permuted outcome, and how often the gap between the first- and second-ranked variable equals or exceeds the gap observed on the real data. The second statistic is the one that carries evidential weight; the first is reported alongside it because the difference between them is instructive.</w:t>
+        <w:t xml:space="preserve">Last, the importance ranking is tested against a null. Debt ranking first on mean absolute SHAP proves little on its own, since some variable must rank first, and tree ensembles favour high-variance continuous regressors even when the outcome is noise. We permute the outcome 500 times, refit the forest and recompute SHAP on each permutation, recording two things: how often debt ranks first, and how often the gap between first and second place matches the gap in the real data. The gap statistic is the one that carries weight. The rank is reported beside it because the two diverge sharply, and the divergence is worth seeing.</w:t>
       </w:r>
     </w:p>
     <w:p>
@@ -24028,7 +23942,7 @@
         <w:jc w:val="both"/>
       </w:pPr>
       <w:r>
-        <w:t>Finally, out-of-sample R-squared is computed for ordinary least squares, LASSO, the random forest and a gradient-boosted alternative, not to claim predictive power at forty-eight observations but to report honestly how much of it exists.</w:t>
+        <w:t xml:space="preserve">Out-of-sample R-squared is computed for ordinary least squares, LASSO, the random forest and a gradient-boosted alternative. Forty-eight observations cannot support a claim to predictive power. The figures are reported to show how much of it exists.</w:t>
       </w:r>
     </w:p>
     <w:p>
@@ -24279,7 +24193,7 @@
         <w:jc w:val="both"/>
       </w:pPr>
       <w:r>
-        <w:t>Each estimator in Section 5.1 embodies a choice — fixed versus random effects, pooled versus panel, one covariance estimator over another — and in a conventional panel those choices would be settled by a short battery of specification tests of the kind set out in Baltagi (2021). At N = 10 and T = 5 that battery is available but weak. The Hausman statistic frequently fails to compute because the difference between the two covariance matrices is not positive definite; the Pesaran CD statistic is asymptotic in the number of entities, of which there are ten; the Wooldridge and Driscoll-Kraay results are asymptotic in the number of periods, of which there are five. Reporting only those tests that happen to return a clean verdict would misrepresent that position. The strategy adopted here is accordingly threefold.</w:t>
+        <w:t xml:space="preserve">Each estimator in Section 5.1 involves a choice: fixed or random effects, pooled or panel, one covariance estimator over another. In a conventional panel a short battery of specification tests would settle those choices (Baltagi, 2021). At N = 10 and T = 5 the battery is available but weak. The Hausman statistic often fails to compute at all, because the difference between the two covariance matrices is not positive definite. Pesaran's CD statistic is asymptotic in the number of entities, and there are ten. The Wooldridge and Driscoll-Kraay results are asymptotic in the number of periods, and there are five. Reporting only the tests that come back clean would misrepresent that position. Three things are done instead.</w:t>
       </w:r>
     </w:p>
     <w:p>
@@ -24287,7 +24201,7 @@
         <w:jc w:val="both"/>
       </w:pPr>
       <w:r>
-        <w:t>First, the formal tests are run and reported in full, including those that return no verdict. Estimator choice is examined with the Hausman test, the Breusch-Pagan LM test and the F-test for poolability; error structure with the Pesaran CD test for cross-sectional dependence, the Wooldridge test for first-order serial correlation, implemented as in Drukker (2003), and the modified Wald test for groupwise heteroskedasticity; and functional form with Ramsey's RESET and a comparison of the logarithmic, inverse-hyperbolic-sine and level transformations of FDI.</w:t>
+        <w:t xml:space="preserve">First, the formal tests are run and reported in full, including those that return no verdict. Estimator choice is examined with the Hausman test, the Breusch-Pagan LM test and the F-test for poolability. For error structure we use Pesaran's CD test for cross-sectional dependence, the Wooldridge test for first-order serial correlation implemented as in Drukker (2003), and the modified Wald test for groupwise heteroskedasticity. Functional form is checked with Ramsey's RESET, and by comparing the logarithmic, inverse-hyperbolic-sine and level transformations of FDI.</w:t>
       </w:r>
     </w:p>
     <w:p>
@@ -24295,8 +24209,7 @@
         <w:jc w:val="both"/>
       </w:pPr>
       <w:r>
-        <w:lastRenderedPageBreak/>
-        <w:t>Second, because those tests are weak, the sensitivity of the inference to the covariance estimator is reported directly rather than assumed. The same fixed-effects coefficient is presented with Driscoll-Kraay, cluster-robust and unadjusted standard errors, and with a percentile interval from 2,000 bootstrap resamples drawn at the level of the state rather than the individual observation, so that the resampling respects the panel structure. Because both the kernel and the cluster-robust estimators rest on asymptotics this panel does not supply — the first in the number of periods, the second in the number of clusters — a wild cluster bootstrap-t with the null imposed and Rademacher weights (Cameron, Gelbach and Miller, 2008) is computed for every coefficient the paper relies on, and treated as the arbiter where the two disagree. Its validity was checked in both directions: the COVID dummy in the growth model, an effect of roughly fourteen percentage points, returns p = 0.003, while eight pure-noise placebo regressors returned no p-value below 0.05.</w:t>
+        <w:t xml:space="preserve">Second, since those tests are weak, we report directly how far the inference depends on the covariance estimator. The same fixed-effects coefficient appears with Driscoll-Kraay, cluster-robust and unadjusted standard errors, and with a percentile interval from 2,000 bootstrap resamples drawn at the level of the state, so that the resampling respects the panel structure. Both the kernel and the cluster-robust estimators rest on asymptotics this panel does not supply, the first in the number of periods and the second in the number of clusters. A wild cluster bootstrap-t with the null imposed and Rademacher weights (Cameron, Gelbach and Miller, 2008) is therefore computed for every coefficient the paper relies on, and settles the cases where the two disagree. We checked it in both directions. The COVID dummy in the growth model, an effect of roughly fourteen percentage points, returns p = 0.003; eight pure-noise placebo regressors returned nothing below 0.05.</w:t>
       </w:r>
     </w:p>
     <w:p>
@@ -24304,7 +24217,7 @@
         <w:jc w:val="both"/>
       </w:pPr>
       <w:r>
-        <w:t>Third, and most informative at this sample size, the debt coefficient is estimated under every defensible combination of modelling choices rather than defended in one: fixed effects or pooled, the pandemic year retained or dropped, Census controls included or omitted, FDI in logarithms or inverse hyperbolic sine, and each of the ten states excluded in turn. That yields 132 estimates, reported as a specification curve. If a result holds across all of them, the question of which single specification is correct loses most of its force. The logic is that of the machine-learning convergence argument of Section 5.2, applied to the econometric branch.</w:t>
+        <w:t xml:space="preserve">Third, the debt coefficient is estimated under every defensible combination of modelling choices instead of being defended in one: fixed effects or pooled, the pandemic year kept or dropped, Census controls in or out, FDI in logarithms or inverse hyperbolic sine, and each of the ten states excluded in turn. That gives 132 estimates, reported as a specification curve. A result holding across all of them makes the question of which single specification is correct much less pressing. The logic mirrors the convergence argument of Section 5.2, moved to the econometric side.</w:t>
       </w:r>
     </w:p>
     <w:p>
@@ -25342,33 +25255,7 @@
           <w:szCs w:val="22"/>
         </w:rPr>
         <w:lastRenderedPageBreak/>
-        <w:t xml:space="preserve">If you look at the numbers in that table one of them gives us a hint of what's coming next. The Debt-to-GSDP is different in each state it goes from 17.6 to 42.5 per cent. This is a difference of fourteen points across ten states and it is not all mixed </w:t>
-      </w:r>
-      <w:proofErr w:type="spellStart"/>
-      <w:proofErr w:type="gramStart"/>
-      <w:r>
-        <w:rPr>
-          <w:rFonts w:ascii="Times New Roman" w:eastAsiaTheme="minorEastAsia" w:hAnsi="Times New Roman" w:cstheme="minorBidi"/>
-          <w:b w:val="0"/>
-          <w:bCs w:val="0"/>
-          <w:color w:val="auto"/>
-          <w:sz w:val="22"/>
-          <w:szCs w:val="22"/>
-        </w:rPr>
-        <w:t>up. West</w:t>
-      </w:r>
-      <w:proofErr w:type="spellEnd"/>
-      <w:proofErr w:type="gramEnd"/>
-      <w:r>
-        <w:rPr>
-          <w:rFonts w:ascii="Times New Roman" w:eastAsiaTheme="minorEastAsia" w:hAnsi="Times New Roman" w:cstheme="minorBidi"/>
-          <w:b w:val="0"/>
-          <w:bCs w:val="0"/>
-          <w:color w:val="auto"/>
-          <w:sz w:val="22"/>
-          <w:szCs w:val="22"/>
-        </w:rPr>
-        <w:t xml:space="preserve"> Bengal and Rajasthan always have the highest Debt-to-GSDP every year. On the hand Gujarat and Maharashtra always have the lowest Debt-to-GSDP. You will see the order when we look at the other results. Debt-to-GSDP numbers, for these states follow the pattern every time.</w:t>
+        <w:t>If you look at the numbers in that table one of them gives us a hint of what's coming next. The Debt-to-GSDP is different in each state it goes from 17.6 to 42.5 per cent. This is a difference of fourteen points across ten states and it is not all mixed up. West Bengal and Rajasthan always have the highest Debt-to-GSDP every year. On the hand Gujarat and Maharashtra always have the lowest Debt-to-GSDP. You will see the order when we look at the other results. Debt-to-GSDP numbers, for these states follow the pattern every time.</w:t>
       </w:r>
     </w:p>
     <w:p>
@@ -26766,7 +26653,7 @@
         <w:jc w:val="both"/>
       </w:pPr>
       <w:r>
-        <w:t xml:space="preserve">The pooled specification with Census controls (n = 48, R² = 0.643, between R² = 0.874, F(7,40) = 10.29, p &lt; 0.001) tells a different, and for the paper's central claim more important, story. Debt is negative and precisely estimated (coefficient -0.176, standard error 0.062, t = -2.84, p = 0.0071 under cluster-robust inference): a one-percentage-point-lower debt-to-GSDP ratio is associated with roughly 17.6 per cent higher FDI, holding the other regressors and the Census controls fixed. Literacy (0.101) and capital expenditure (-0.366) also clear conventional significance under those same standard errors, at p = 0.035 and p = 0.008 respectively, while fiscal deficit, own tax revenue, the COVID dummy and urbanisation do not. Ten clusters is too few for the cluster-robust t-distribution to be reliable, however, so all of these p-values are re-computed by wild cluster bootstrap in Section 6.7. Debt is the only regressor that approaches conventional significance under that stricter standard (p = 0.057, significant at the 10 per cent level); literacy (p = 0.235) and capital expenditure (p = 0.094) do not survive it, and neither is relied upon in what follows.</w:t>
+        <w:t>The pooled specification with Census controls (n = 48, R² = 0.643, between R² = 0.874, F(7,40) = 10.29, p &lt; 0.001) tells a different, and for the paper's central claim more important, story. Debt is negative and precisely estimated (coefficient -0.176, standard error 0.062, t = -2.84, p = 0.0071 under cluster-robust inference): a one-percentage-point-lower debt-to-GSDP ratio is associated with roughly 17.6 per cent higher FDI, holding the other regressors and the Census controls fixed. Literacy (0.101) and capital expenditure (-0.366) also clear conventional significance under those same standard errors, at p = 0.035 and p = 0.008 respectively, while fiscal deficit, own tax revenue, the COVID dummy and urbanisation do not. Ten clusters is too few for the cluster-robust t-distribution to be reliable, however, so all of these p-values are re-computed by wild cluster bootstrap in Section 6.7. Debt is the only regressor that approaches conventional significance under that stricter standard (p = 0.057, significant at the 10 per cent level); literacy (p = 0.235) and capital expenditure (p = 0.094) do not survive it, and neither is relied upon in what follows.</w:t>
       </w:r>
     </w:p>
     <w:p>
@@ -35499,7 +35386,7 @@
         <w:jc w:val="both"/>
       </w:pPr>
       <w:r>
-        <w:t>The F-test for poolability strongly rejects pooling in the FDI model: F(9,33) = 6.741, p &lt; 0.0001, so state effects are jointly significant and the fixed-effects specification is justified on the test's own terms. It does not do so in the growth model, where F(9,35) = 0.818, p = 0.603. Fixed effects are retained there notwithstanding, because the estimator remains consistent where random effects would be biased and because the theoretical argument of Section 3 requires state-level controls; but that is a modelling decision rather than a verdict the test delivered, and it is reported as such. The Hausman test returns no verdict for the FDI model: the difference between the fixed- and random-effects covariance matrices is not positive definite, a routine outcome at ten entities. For the growth model it computes, at 6.319 on four degrees of freedom (p = 0.177), so random effects are not rejected there either.</w:t>
+        <w:t xml:space="preserve">The F-test for poolability rejects pooling in the FDI model: F(9,33) = 6.741, p &lt; 0.0001. State effects are jointly significant and the fixed-effects specification is justified. In the growth model it does not: F(9,35) = 0.818, p = 0.603. We keep fixed effects there anyway, because the estimator stays consistent where random effects would be biased, and because the argument of Section 3 requires state-level controls. That is a modelling decision, not a verdict the test delivered, and we report it as one. The Hausman test returns nothing at all for the FDI model: the difference between the fixed- and random-effects covariance matrices is not positive definite, a routine outcome at ten entities. For the growth model it computes, at 6.319 on four degrees of freedom (p = 0.177), so random effects are not rejected there either.</w:t>
       </w:r>
     </w:p>
     <w:p>
@@ -35507,19 +35394,15 @@
         <w:jc w:val="both"/>
       </w:pPr>
       <w:r>
-        <w:t>The three tests bearing on the covariance estimator return a more mixed picture than the choice of Driscoll-Kraay would imply. In the FDI model the Pesaran CD statistic is 0.019 (p = 0.985) and the Wooldridge test gives a first-difference autocorrelation of -0.051 (p = 0.810): neither cross-sectional dependence nor serial correlation is detectable. In the growth model cross-sectional dependence is unambiguous, CD = 8.397 (p &lt; 0.0001), which is what one would expect of a panel whose middle year is a shock common to every state. The modified Wald test rejects homoskedasticity across states in both models (p &lt; 0.0001). Driscoll-Kraay is therefore clearly warranted for the growth model; for the FDI model the heteroskedasticity is real but the dependence the estimator exists to absorb is not detectable, and a cluster-robust estimator would be the more natural default.</w:t>
+        <w:t xml:space="preserve">The three tests bearing on the covariance estimator give a more mixed picture than the use of Driscoll-Kraay implies. In the FDI model, Pesaran's CD statistic is 0.019 (p = 0.985) and the Wooldridge test gives a first-difference autocorrelation of -0.051 (p = 0.810). Neither cross-sectional dependence nor serial correlation shows up. In the growth model the dependence is unambiguous, CD = 8.397 (p &lt; 0.0001), as it should be in a panel whose middle year is a shock common to every state. The modified Wald test rejects homoskedasticity across states in both models (p &lt; 0.0001). Driscoll-Kraay is clearly warranted for the growth model. For the FDI model the heteroskedasticity is real but the dependence the estimator exists to absorb is not, and a cluster-robust estimator would be the more natural default.</w:t>
       </w:r>
     </w:p>
     <w:p>
       <w:pPr>
-        <w:spacing w:after="40"/>
         <w:jc w:val="both"/>
       </w:pPr>
       <w:r>
-        <w:rPr>
-          <w:b/>
-        </w:rPr>
-        <w:t>Table 32. Specification and diagnostic tests, both models. Tests returning no verdict are reported rather than omitted.</w:t>
+        <w:t xml:space="preserve">Table 32. Specification and diagnostic tests, both models. Tests that return no verdict are included.</w:t>
       </w:r>
     </w:p>
     <w:tbl>
@@ -36108,7 +35991,7 @@
         <w:jc w:val="both"/>
       </w:pPr>
       <w:r>
-        <w:t>That distinction matters, because Driscoll-Kraay does not behave conservatively at this panel length. Table 33 reports the within-state debt coefficient under three covariance estimators. The point estimate is identical by construction; the standard error is not. Driscoll-Kraay returns 0.042, cluster-robust 0.084 and the unadjusted estimator 0.106. A kernel estimator whose properties are asymptotic in T is being applied at T = 5, and it produces the tightest of the three intervals rather than the widest — the same numerical fragility that leaves a negative robust F-statistic in the fixed-effects output. The substantive conclusion is unaffected. The coefficient remains significant under cluster-robust inference (p = 0.0002), and a bootstrap that resamples whole states rather than individual observations gives a 95 per cent interval of [+0.074, +0.522], which excludes zero. Readers should nonetheless treat the cluster-robust column as the conservative reading of the within-state results reported in Section 6.3.</w:t>
+        <w:t xml:space="preserve">That distinction matters, because Driscoll-Kraay does not behave conservatively at this panel length. Table 33 gives the within-state debt coefficient under three covariance estimators. The point estimate is identical by construction. The standard error is not: Driscoll-Kraay returns 0.042, cluster-robust 0.084, and the unadjusted estimator 0.106. A kernel estimator whose properties are asymptotic in T is being applied at T = 5, and it produces the tightest of the three intervals instead of the widest. The same numerical fragility leaves a negative robust F-statistic in the fixed-effects output. None of this changes the substantive conclusion. The coefficient stays significant under cluster-robust inference (p = 0.0002), and a bootstrap resampling whole states gives a 95 per cent interval of [+0.074, +0.522], which excludes zero. The cluster-robust column is the conservative reading of the within-state results in Section 6.3, and should be read as such.</w:t>
       </w:r>
     </w:p>
     <w:p>
@@ -36504,7 +36387,7 @@
         <w:jc w:val="both"/>
       </w:pPr>
       <w:r>
-        <w:t>The specification curve is the most informative of the three exercises. Across 88 pooled specifications the debt coefficient is negative in every single one, ranging from -0.269 to -0.087 with a median of -0.198, and significant at the 5 per cent level in 89 per cent of them. Across 44 fixed-effects specifications it is positive in every single one, from +0.128 to +0.417 with a median of +0.338, and significant in 95 per cent. Neither sign is a specification artefact. The two are separated by the dimension of variation the estimator uses and by nothing else, which is the strongest form the argument of Section 7.1 can take: the between-state and the within-state results are each robust to every other choice available, and they still disagree.</w:t>
+        <w:t xml:space="preserve">Across 88 pooled specifications the debt coefficient is negative in every one, ranging from -0.269 to -0.087 with a median of -0.198, and significant at the 5 per cent level in 89 per cent of them. Across 44 fixed-effects specifications it is positive in every one, from +0.128 to +0.417 with a median of +0.338, significant in 95 per cent. Neither sign is a specification artefact. What separates them is the dimension of variation the estimator uses, and nothing else. That is as far as the argument of Section 7.1 can be pushed: the between-state and within-state results each survive every other choice available, and they still disagree.</w:t>
       </w:r>
     </w:p>
     <w:p>
@@ -36579,7 +36462,7 @@
         <w:jc w:val="both"/>
       </w:pPr>
       <w:r>
-        <w:t>Neither the kernel nor the cluster-robust estimator is on firm ground here: the first is asymptotic in the number of periods, of which there are five, and the second in the number of clusters, of which there are ten. Where they disagree, the wild cluster bootstrap adjudicates, and Table 34 reports it for every coefficient the paper relies on. Two of its verdicts differ from what Driscoll-Kraay reports, and both are recorded here rather than left in a footnote.</w:t>
+        <w:t xml:space="preserve">Neither the kernel nor the cluster-robust estimator stands on firm ground here. The first is asymptotic in the number of periods, of which there are five; the second in the number of clusters, of which there are ten. Where they disagree the wild cluster bootstrap settles it, and Table 34 reports it for every coefficient the paper uses. Two of its verdicts differ from what Driscoll-Kraay gives. Both are set out below.</w:t>
       </w:r>
     </w:p>
     <w:p>
@@ -36587,7 +36470,7 @@
         <w:jc w:val="both"/>
       </w:pPr>
       <w:r>
-        <w:t>The first concerns the growth equation. Under Driscoll-Kraay the fiscal deficit enters negatively at p = 0.031, a result that would replicate Trivedi and Rajmal (2011) and Panda and Sahay (2022) on newer audited data. It does not survive: cluster-robust inference puts it at p = 0.310 and the bootstrap at p = 0.448. The coefficient is large but too imprecisely estimated at fifty observations across ten states to support a claim. H2 is nonetheless supported, through a different channel than originally proposed: within states, debt (+1.097, bootstrap p = 0.020) and own tax revenue (+4.083, bootstrap p = 0.028) are both significantly associated with growth under every method of inference applied. The deficit channel is the one this panel cannot speak to.</w:t>
+        <w:t xml:space="preserve">The first concerns the growth equation. Under Driscoll-Kraay the fiscal deficit enters negatively at p = 0.031, which would replicate Trivedi and Rajmal (2011) and Panda and Sahay (2022) on newer audited data. It does not survive. Cluster-robust inference puts it at p = 0.310 and the bootstrap at p = 0.448. The coefficient is large but too imprecisely estimated, at fifty observations across ten states, to support a claim. H2 still holds, through a channel we did not originally propose: within states, debt (+1.097, bootstrap p = 0.020) and own tax revenue (+4.083, bootstrap p = 0.028) are both significantly associated with growth under every method of inference we apply. The deficit channel is the one this panel cannot speak to.</w:t>
       </w:r>
     </w:p>
     <w:p>
@@ -36595,11 +36478,7 @@
         <w:jc w:val="both"/>
       </w:pPr>
       <w:r>
-        <w:t xml:space="preserve">The second concerns the magnitude, though not the direction, of the paper's central result. The pooled debt-FDI coefficient is significant at p = 0.007 under cluster-robust inference and at p = 0.057 under the bootstrap: significant at the 10 per cent level, marginally short of 5. Two of the pooled model's secondary results, literacy (p = 0.235) and capital expenditure (p = 0.095), do not survive at either level and are not relied upon. What does not change is the evidence that never depended on a standard error: the debt coefficient is negative in all 88 pooled specifications of the curve above, LASSO and Elastic Net rank </w:t>
-      </w:r>
-      <w:r>
-        <w:lastRenderedPageBreak/>
-        <w:t>it first by a wide margin, SHAP ranks it first in all ten leave-one-state-out refits, and the permutation null puts the importance margin at p = 0.004. The case for H1 rests on that convergence, which is why the paper was built to produce it rather than to lean on a single p-value.</w:t>
+        <w:t xml:space="preserve">The second concerns the size of the paper's central result, though not its direction. The pooled debt-FDI coefficient is significant at p = 0.007 under cluster-robust inference and at p = 0.057 under the bootstrap: significant at 10 per cent, marginally short of 5. Two secondary results from the pooled model, literacy (p = 0.235) and capital expenditure (p = 0.095), survive at neither level and we do not rely on them. The evidence that never depended on a standard error is unchanged. Debt is negative in all 88 pooled specifications of the curve above; LASSO and Elastic Net rank it first by a wide margin; SHAP ranks it first in all ten leave-one-state-out refits; the permutation null puts the importance margin at p = 0.004. H1 rests on that convergence. The paper was designed to produce it, precisely so the claim would not hang on one p-value.</w:t>
       </w:r>
     </w:p>
     <w:p>
@@ -37500,7 +37379,7 @@
         <w:jc w:val="both"/>
       </w:pPr>
       <w:r>
-        <w:t>The model choices behind Section 6 are therefore defended in three ways rather than one: by the formal tests where they are valid, reported including the two that return no verdict; by showing that the inference does not turn on which covariance estimator is used; and by a specification curve in which the cross-state result holds in all 88 specifications. No single test statistic could carry that weight at forty-eight observations, and none is asked to.</w:t>
+        <w:t xml:space="preserve">The model choices behind Section 6 are defended three ways instead of one: by the formal tests where they are valid, including the two that return no verdict; by showing that the inference does not turn on which covariance estimator is used; and by a specification curve in which the cross-state result holds in all 88 specifications. No single test statistic could carry that weight at forty-eight observations. None is asked to.</w:t>
       </w:r>
     </w:p>
     <w:p>
@@ -37524,7 +37403,7 @@
         <w:jc w:val="both"/>
       </w:pPr>
       <w:r>
-        <w:t xml:space="preserve">The central puzzle in Section 6.3 is that debt enters Model 1 negative in the pooled cross-state specification and positive in the within-state fixed-effects specification, and that both are estimated precisely enough to take seriously: the pooled coefficient at p = 0.007 under cluster-robust inference and p = 0.057 under the wild cluster bootstrap of Section 6.7, the within-state coefficient at p = 0.031 under that same bootstrap. Both estimates are correct. They answer different questions. The pooled coefficient asks whether a state that persistently carries less debt than its peers attracts more FDI than they do. It does, and the magnitude, roughly 18 per cent more FDI per percentage point of lower debt-to-GSDP, lines up with the discipline ranking of Section 4.7. The two lowest-debt states in the panel, Gujarat and Maharashtra, rank first or second overall in almost every year; the highest-debt state, West Bengal, ranks last in all five. It lines up too with the Spearman correlation of Section 6.2, which turns significant (rho = 0.728, p = 0.026) once the one state whose FDI series is an accounting artefact rather than a genuine low outcome is set aside.</w:t>
+        <w:t>The central puzzle in Section 6.3 is that debt enters Model 1 negative in the pooled cross-state specification and positive in the within-state fixed-effects specification, and that both are estimated precisely enough to take seriously: the pooled coefficient at p = 0.007 under cluster-robust inference and p = 0.057 under the wild cluster bootstrap of Section 6.7, the within-state coefficient at p = 0.031 under that same bootstrap. Both estimates are correct. They answer different questions. The pooled coefficient asks whether a state that persistently carries less debt than its peers attracts more FDI than they do. It does, and the magnitude, roughly 18 per cent more FDI per percentage point of lower debt-to-GSDP, lines up with the discipline ranking of Section 4.7. The two lowest-debt states in the panel, Gujarat and Maharashtra, rank first or second overall in almost every year; the highest-debt state, West Bengal, ranks last in all five. It lines up too with the Spearman correlation of Section 6.2, which turns significant (rho = 0.728, p = 0.026) once the one state whose FDI series is an accounting artefact rather than a genuine low outcome is set aside.</w:t>
       </w:r>
     </w:p>
     <w:p>
@@ -37532,7 +37411,8 @@
         <w:jc w:val="both"/>
       </w:pPr>
       <w:r>
-        <w:t xml:space="preserve">The fixed-effects coefficient asks a different question: when a state's own debt ratio rises above its usual level, does its FDI rise with it? Over this window it does, and not because borrowing attracts investors. Five years is a short series and one of them, FY 2020-21, is a shock common to every state. Deficits and debt rose everywhere at once while FDI fell everywhere; inflows then recovered through FY 2021-22 and FY 2022-23 while debt remained at its elevated pandemic level. Gujarat's FDI rose in FY 2020-21 and Karnataka's in FY 2021-22, both while debt stood above its pre-pandemic ratio. Debt and FDI therefore move together within states over this window for reasons that have little to do with either causing the other, and a five-year panel containing a shock of that size cannot separate them. The within-state estimate is best read as a description of the COVID window rather than as a behavioural relationship.</w:t>
+        <w:lastRenderedPageBreak/>
+        <w:t>The fixed-effects coefficient asks a different question: when a state's own debt ratio rises above its usual level, does its FDI rise with it? Over this window it does, and not because borrowing attracts investors. Five years is a short series and one of them, FY 2020-21, is a shock common to every state. Deficits and debt rose everywhere at once while FDI fell everywhere; inflows then recovered through FY 2021-22 and FY 2022-23 while debt remained at its elevated pandemic level. Gujarat's FDI rose in FY 2020-21 and Karnataka's in FY 2021-22, both while debt stood above its pre-pandemic ratio. Debt and FDI therefore move together within states over this window for reasons that have little to do with either causing the other, and a five-year panel containing a shock of that size cannot separate them. The within-state estimate is best read as a description of the COVID window rather than as a behavioural relationship.</w:t>
       </w:r>
     </w:p>
     <w:p>
@@ -37559,7 +37439,7 @@
         <w:jc w:val="both"/>
       </w:pPr>
       <w:r>
-        <w:t xml:space="preserve">Capital expenditure enters the FDI specification with a negative coefficient, -0.366, significant under cluster-robust inference (p = 0.008) though not under the wild cluster bootstrap of Section 6.7 (p = 0.094). The paper accordingly rests no claim on it. The sign is nonetheless the opposite of what the crowding-in channel of Section 2 predicts, and it is stable enough across the specification curve to be worth explaining rather than dismissed. Two features of the measure account for most of it.</w:t>
+        <w:t>Capital expenditure enters the FDI specification with a negative coefficient, -0.366, significant under cluster-robust inference (p = 0.008) though not under the wild cluster bootstrap of Section 6.7 (p = 0.094). The paper accordingly rests no claim on it. The sign is nonetheless the opposite of what the crowding-in channel of Section 2 predicts, and it is stable enough across the specification curve to be worth explaining rather than dismissed. Two features of the measure account for most of it.</w:t>
       </w:r>
     </w:p>
     <w:p>
@@ -37649,7 +37529,6 @@
         <w:pStyle w:val="Heading2"/>
       </w:pPr>
       <w:r>
-        <w:lastRenderedPageBreak/>
         <w:t>7.3 The Jharkhand and Uttar Pradesh cases</w:t>
       </w:r>
     </w:p>
@@ -37658,7 +37537,7 @@
         <w:jc w:val="both"/>
       </w:pPr>
       <w:r>
-        <w:t xml:space="preserve">Jharkhand shows that discipline does not by itself deliver investment. It sits mid-table on the composite ranking, sixth of ten with an average score of 5.8, yet its FDI is the most erratic in the panel: a substantial inflow in FY 2019-20, then almost nothing from FY 2020-21 onward. Excluding it moves the within-state estimates more than excluding any other state (Section 6.5), which is why it is discussed separately rather than absorbed into the average. Its trajectory diverges sharply from Gujarat's or Karnataka's, and the reasons are specific rather than fiscal: political turnover, difficulties in the mining sector on which much of its investment case rests, and infrastructure that compares poorly with the states above it. Fiscal prudence appears necessary for a state to be considered; Jharkhand demonstrates that it is not sufficient for a state to be chosen.</w:t>
+        <w:t>Jharkhand shows that discipline does not by itself deliver investment. It sits mid-table on the composite ranking, sixth of ten with an average score of 5.8, yet its FDI is the most erratic in the panel: a substantial inflow in FY 2019-20, then almost nothing from FY 2020-21 onward. Excluding it moves the within-state estimates more than excluding any other state (Section 6.5), which is why it is discussed separately rather than absorbed into the average. Its trajectory diverges sharply from Gujarat's or Karnataka's, and the reasons are specific rather than fiscal: political turnover, difficulties in the mining sector on which much of its investment case rests, and infrastructure that compares poorly with the states above it. Fiscal prudence appears necessary for a state to be considered; Jharkhand demonstrates that it is not sufficient for a state to be chosen.</w:t>
       </w:r>
     </w:p>
     <w:p>
@@ -37666,7 +37545,7 @@
         <w:jc w:val="both"/>
       </w:pPr>
       <w:r>
-        <w:t xml:space="preserve">Uttar Pradesh is the mirror case, and its anomaly is one of measurement rather than performance. DPIIT's series for the state begins only in FY 2021-22, so its first two cells are missing rather than zero. On fiscal discipline it ranks at or near the top throughout, first of ten with an average score of 2.2. Whether that censoring distorts the results was tested directly: dropping the state leaves the regression estimates substantially unchanged (Section 6.5), but it does move the Spearman correlation of Section 6.2 from insignificant to significant (rho = 0.728, p = 0.026). That pattern is what one would expect. A regression using forty-eight state-year observations absorbs two missing cells; a rank correlation that compresses each state to a single five-year total does not, because the missing years drag Uttar Pradesh's total down and its rank with it.</w:t>
+        <w:t>Uttar Pradesh is the mirror case, and its anomaly is one of measurement rather than performance. DPIIT's series for the state begins only in FY 2021-22, so its first two cells are missing rather than zero. On fiscal discipline it ranks at or near the top throughout, first of ten with an average score of 2.2. Whether that censoring distorts the results was tested directly: dropping the state leaves the regression estimates substantially unchanged (Section 6.5), but it does move the Spearman correlation of Section 6.2 from insignificant to significant (rho = 0.728, p = 0.026). That pattern is what one would expect. A regression using forty-eight state-year observations absorbs two missing cells; a rank correlation that compresses each state to a single five-year total does not, because the missing years drag Uttar Pradesh's total down and its rank with it.</w:t>
       </w:r>
     </w:p>
     <w:p>
@@ -37674,6 +37553,7 @@
         <w:pStyle w:val="Heading2"/>
       </w:pPr>
       <w:r>
+        <w:lastRenderedPageBreak/>
         <w:t>7.4 What the agglomeration rival hypothesis survives</w:t>
       </w:r>
     </w:p>
@@ -37682,7 +37562,7 @@
         <w:jc w:val="both"/>
       </w:pPr>
       <w:r>
-        <w:t xml:space="preserve">Section 3 set out the rival explanation: foreign investment follows existing industrial clusters and metropolitan markets, and a state's fiscal position is largely incidental to where it goes. Nothing in this study refutes that hypothesis. The results are better read as locating fiscal discipline within it than as displacing it.</w:t>
+        <w:t>Section 3 set out the rival explanation: foreign investment follows existing industrial clusters and metropolitan markets, and a state's fiscal position is largely incidental to where it goes. Nothing in this study refutes that hypothesis. The results are better read as locating fiscal discipline within it than as displacing it.</w:t>
       </w:r>
     </w:p>
     <w:p>
@@ -37690,7 +37570,7 @@
         <w:jc w:val="both"/>
       </w:pPr>
       <w:r>
-        <w:t xml:space="preserve">The machine-learning stage speaks most directly to the point, though not in the direction the first run suggested. That run included the two Census controls and ranked urbanisation as the dominant predictor, which would have been a striking vindication of the agglomeration account. It was not one. Urbanisation is fixed within a state across all five years, so the forest was using it to identify which state an observation came from, re-learning the state fixed effect rather than measuring any agglomeration mechanism. The result is an artefact of the panel's shape and carries no evidence about clustering in either direction, which is why Section 5.2 reports it as a diagnostic failure and Section 6.6 excludes both controls. It cannot be cited in support of the rival hypothesis, and it is not cited here.</w:t>
+        <w:t>The machine-learning stage speaks most directly to the point, though not in the direction the first run suggested. That run included the two Census controls and ranked urbanisation as the dominant predictor, which would have been a striking vindication of the agglomeration account. It was not one. Urbanisation is fixed within a state across all five years, so the forest was using it to identify which state an observation came from, re-learning the state fixed effect rather than measuring any agglomeration mechanism. The result is an artefact of the panel's shape and carries no evidence about clustering in either direction, which is why Section 5.2 reports it as a diagnostic failure and Section 6.6 excludes both controls. It cannot be cited in support of the rival hypothesis, and it is not cited here.</w:t>
       </w:r>
     </w:p>
     <w:p>
@@ -37698,7 +37578,7 @@
         <w:jc w:val="both"/>
       </w:pPr>
       <w:r>
-        <w:t xml:space="preserve">What the corrected analysis does show is that once attention is restricted to variation this panel can actually speak to, debt ranks first among the fiscal predictors in both the pooled and the state-demeaned specifications (Section 6.6). The pooled regression retains literacy and urbanisation as controls and the debt coefficient survives their inclusion, so the cross-state result is not merely a restatement of which states are already developed and urbanised.</w:t>
+        <w:t>What the corrected analysis does show is that once attention is restricted to variation this panel can actually speak to, debt ranks first among the fiscal predictors in both the pooled and the state-demeaned specifications (Section 6.6). The pooled regression retains literacy and urbanisation as controls and the debt coefficient survives their inclusion, so the cross-state result is not merely a restatement of which states are already developed and urbanised.</w:t>
       </w:r>
     </w:p>
     <w:p>
@@ -37706,7 +37586,7 @@
         <w:jc w:val="both"/>
       </w:pPr>
       <w:r>
-        <w:t xml:space="preserve">The reading we take is that the two accounts operate at different levels rather than in competition. Structural advantages — location, port access, an established industrial base, the depth of a metropolitan labour market — determine which states are candidates for large inflows at all, and the ten states in this sample are precisely those that have already cleared that bar. Fiscal position then appears to sort investment among them. That is consistent with the between-state result of Section 7.1, and it is also why the finding should not be extrapolated: it describes how capital is allocated among states already in contention, not how a state enters contention in the first place. Section 8 returns to this as the study's principal limit on external validity.</w:t>
+        <w:t>The reading we take is that the two accounts operate at different levels rather than in competition. Structural advantages — location, port access, an established industrial base, the depth of a metropolitan labour market — determine which states are candidates for large inflows at all, and the ten states in this sample are precisely those that have already cleared that bar. Fiscal position then appears to sort investment among them. That is consistent with the between-state result of Section 7.1, and it is also why the finding should not be extrapolated: it describes how capital is allocated among states already in contention, not how a state enters contention in the first place. Section 8 returns to this as the study's principal limit on external validity.</w:t>
       </w:r>
     </w:p>
     <w:p>
@@ -37730,19 +37610,7 @@
         <w:jc w:val="both"/>
       </w:pPr>
       <w:r>
-        <w:t xml:space="preserve">Foreign Direct Investment in India is more likely to happen when a state has financial </w:t>
-      </w:r>
-      <w:proofErr w:type="gramStart"/>
-      <w:r>
-        <w:t>control.</w:t>
-      </w:r>
-      <w:proofErr w:type="gramEnd"/>
-      <w:r>
-        <w:t xml:space="preserve"> This is only true when we compare different states not when we look at what happens within a single state over five years. States like Gujarat and Maharashtra which have kept their debt low compared to their state </w:t>
-      </w:r>
-      <w:r>
-        <w:lastRenderedPageBreak/>
-        <w:t>product get a lot more Foreign Direct Investment than states that have not done this. We used five methods to check this and they all said the same thing: states with low debt get more Foreign Direct Investment. These methods are all different. Do not rely on the same assumptions but they all looked at the same information from forty-eight to fifty observations.</w:t>
+        <w:t>Foreign Direct Investment in India is more likely to happen when a state has financial control. This is only true when we compare different states not when we look at what happens within a single state over five years. States like Gujarat and Maharashtra which have kept their debt low compared to their state product get a lot more Foreign Direct Investment than states that have not done this. We used five methods to check this and they all said the same thing: states with low debt get more Foreign Direct Investment. These methods are all different. Do not rely on the same assumptions but they all looked at the same information from forty-eight to fifty observations.</w:t>
       </w:r>
     </w:p>
     <w:p>
@@ -37750,7 +37618,11 @@
         <w:jc w:val="both"/>
       </w:pPr>
       <w:r>
-        <w:t>Within states over time, the picture is different and narrower than we first supposed. Higher debt and stronger own tax revenue are both significantly associated with growth under every method of inference we apply. The fiscal deficit is not: its coefficient is large and negative, and significant under the Driscoll-Kraay standard errors conventional in this literature, but it does not survive a wild cluster bootstrap appropriate to ten clusters, and we therefore do not claim it. That is a departure from Trivedi and Rajmal (2011) and Panda and Sahay (2022), who find a deficit-growth effect on longer panels of more states; we read our result as a limit of a five-year panel of ten states rather than as a contradiction of theirs. The substantive finding that does hold across both models is the distinction between dimensions: comparing states with one another, debt predicts FDI; following a single state across five years, it does not. Investors appear to price a state's standing fiscal position rather than any single year's budget arithmetic. Section 7.1 develops the point, and notes that a window containing the pandemic is the least favourable setting in which to test it.</w:t>
+        <w:t xml:space="preserve">Within states over time, the picture is different and narrower than we first supposed. Higher debt and stronger own tax revenue are both significantly associated with growth under every method of inference we apply. The fiscal deficit is not: its coefficient is large and negative, and significant under the Driscoll-Kraay standard errors conventional in this literature, but it does not survive a wild cluster bootstrap appropriate to ten clusters, and we therefore do not claim it. That is a departure from Trivedi and Rajmal (2011) and Panda and Sahay (2022), who find a deficit-growth effect on longer panels of more states; we read our result as a limit of a five-year panel of ten states rather than as a contradiction of theirs. The substantive finding that does hold across both models is the distinction between dimensions: comparing states with one another, debt predicts FDI; following a single state across five years, it does not. Investors </w:t>
+      </w:r>
+      <w:r>
+        <w:lastRenderedPageBreak/>
+        <w:t>appear to price a state's standing fiscal position rather than any single year's budget arithmetic. Section 7.1 develops the point, and notes that a window containing the pandemic is the least favourable setting in which to test it.</w:t>
       </w:r>
     </w:p>
     <w:p>
@@ -37758,63 +37630,7 @@
         <w:jc w:val="both"/>
       </w:pPr>
       <w:r>
-        <w:t xml:space="preserve">State finance departments have three things to think </w:t>
-      </w:r>
-      <w:proofErr w:type="spellStart"/>
-      <w:r>
-        <w:t>about. First</w:t>
-      </w:r>
-      <w:proofErr w:type="spellEnd"/>
-      <w:r>
-        <w:t xml:space="preserve"> they need to consider how long it takes to see results from their </w:t>
-      </w:r>
-      <w:proofErr w:type="spellStart"/>
-      <w:r>
-        <w:t>investments. If</w:t>
-      </w:r>
-      <w:proofErr w:type="spellEnd"/>
-      <w:r>
-        <w:t xml:space="preserve"> a state wants to show its strength compared to states it needs to think about the long term, not just one </w:t>
-      </w:r>
-      <w:proofErr w:type="spellStart"/>
-      <w:r>
-        <w:t>year. It</w:t>
-      </w:r>
-      <w:proofErr w:type="spellEnd"/>
-      <w:r>
-        <w:t xml:space="preserve"> is like making an investment that will take a few years to pay off not something that will show results right </w:t>
-      </w:r>
-      <w:proofErr w:type="spellStart"/>
-      <w:r>
-        <w:t>away. If</w:t>
-      </w:r>
-      <w:proofErr w:type="spellEnd"/>
-      <w:r>
-        <w:t xml:space="preserve"> a department reduces its debt by a bit and expects to see a big change in investment right away it is probably looking at things the wrong </w:t>
-      </w:r>
-      <w:proofErr w:type="spellStart"/>
-      <w:r>
-        <w:t>way. The</w:t>
-      </w:r>
-      <w:proofErr w:type="spellEnd"/>
-      <w:r>
-        <w:t xml:space="preserve"> second thing to think about is what to use to measure how well a state is </w:t>
-      </w:r>
-      <w:proofErr w:type="spellStart"/>
-      <w:r>
-        <w:t>doing. There</w:t>
-      </w:r>
-      <w:proofErr w:type="spellEnd"/>
-      <w:r>
-        <w:t xml:space="preserve"> are a few ways to measure this but debt is the one that is easiest to understand and </w:t>
-      </w:r>
-      <w:proofErr w:type="spellStart"/>
-      <w:r>
-        <w:t>verify. Deficits</w:t>
-      </w:r>
-      <w:proofErr w:type="spellEnd"/>
-      <w:r>
-        <w:t xml:space="preserve"> are also important for growth. When it comes to investment it is the total amount of debt that matters, not just the amount added each year.</w:t>
+        <w:t>State finance departments have three things to think about. First they need to consider how long it takes to see results from their investments. If a state wants to show its strength compared to states it needs to think about the long term, not just one year. It is like making an investment that will take a few years to pay off not something that will show results right away. If a department reduces its debt by a bit and expects to see a big change in investment right away it is probably looking at things the wrong way. The second thing to think about is what to use to measure how well a state is doing. There are a few ways to measure this but debt is the one that is easiest to understand and verify. Deficits are also important for growth. When it comes to investment it is the total amount of debt that matters, not just the amount added each year.</w:t>
       </w:r>
       <w:r>
         <w:t xml:space="preserve"> </w:t>
@@ -37904,17 +37720,7 @@
         <w:t xml:space="preserve"> </w:t>
       </w:r>
       <w:r>
-        <w:t xml:space="preserve">We did this with our ranking, which is explained in detail so anyone can understand and challenge </w:t>
-      </w:r>
-      <w:proofErr w:type="spellStart"/>
-      <w:proofErr w:type="gramStart"/>
-      <w:r>
-        <w:t>it. We</w:t>
-      </w:r>
-      <w:proofErr w:type="spellEnd"/>
-      <w:proofErr w:type="gramEnd"/>
-      <w:r>
-        <w:t xml:space="preserve"> also tested our ranking, against outcomes and reported the results even when they were not what we expected.</w:t>
+        <w:t>We did this with our ranking, which is explained in detail so anyone can understand and challenge it. We also tested our ranking, against outcomes and reported the results even when they were not what we expected.</w:t>
       </w:r>
       <w:r>
         <w:t xml:space="preserve"> Jharkhand is a caution against reading any ranking mechanically. It sits mid-table on discipline and near the bottom on realised investment, and its trajectory does real work in the within-state estimates. Discipline appears necessary; Jharkhand demonstrates that it is not sufficient. A state government that improves its fiscal position without addressing the sector-specific and region-specific frictions an investor also weighs, whether infrastructure gaps, land and clearance processes, or the particular investment cycle of a dominant industry, should not expect FDI to follow automatically. The reverse caution applies to Uttar Pradesh, whose apparent weakness on the investment side is an artefact of when DPIIT began reporting its series rather than a statement about the state.</w:t>
@@ -37925,11 +37731,7 @@
         <w:jc w:val="both"/>
       </w:pPr>
       <w:r>
-        <w:t xml:space="preserve">Four limitations bound these conclusions, and the first is simply arithmetic. The panel is short: fifty state-year cells, forty-eight of them with a usable FDI observation. That is why the paper leans on convergent machine-learning and rank-correlation evidence instead of the regression p-values alone, </w:t>
-      </w:r>
-      <w:r>
-        <w:lastRenderedPageBreak/>
-        <w:t>and why instrument-heavy dynamic panel GMM was excluded by design at this N and T (Roodman, 2009). A short panel also means that any single influential year or state can move a coefficient materially, which is precisely what Section 6.5 documents for Jharkhand.</w:t>
+        <w:t>Four limitations bound these conclusions, and the first is simply arithmetic. The panel is short: fifty state-year cells, forty-eight of them with a usable FDI observation. That is why the paper leans on convergent machine-learning and rank-correlation evidence instead of the regression p-values alone, and why instrument-heavy dynamic panel GMM was excluded by design at this N and T (Roodman, 2009). A short panel also means that any single influential year or state can move a coefficient materially, which is precisely what Section 6.5 documents for Jharkhand.</w:t>
       </w:r>
     </w:p>
     <w:p>
@@ -37945,7 +37747,11 @@
         <w:jc w:val="both"/>
       </w:pPr>
       <w:r>
-        <w:t xml:space="preserve">Third the debt measure is the on-budget figure from the CAG-audited finance accounts. It does not include off-budget borrowings and guarantees which for Telangana have been estimated at about 14 to 15 per cent of GSDP. That is an enough number to change how we see the real fiscal risk. Since the main result of the paper is about debt this is the limitation that's most likely to affect the size of the estimated effect. </w:t>
+        <w:t xml:space="preserve">Third the debt measure is the on-budget figure from the CAG-audited finance accounts. It does not include off-budget borrowings and guarantees which for Telangana have been estimated at about 14 to 15 per cent of GSDP. That is an enough number to change how we see the real fiscal risk. Since the </w:t>
+      </w:r>
+      <w:r>
+        <w:lastRenderedPageBreak/>
+        <w:t xml:space="preserve">main result of the paper is about debt this is the limitation that's most likely to affect the size of the estimated effect. </w:t>
       </w:r>
       <w:proofErr w:type="gramStart"/>
       <w:r>
@@ -37985,7 +37791,6 @@
         <w:pStyle w:val="Heading1"/>
       </w:pPr>
       <w:r>
-        <w:lastRenderedPageBreak/>
         <w:t>Data and Code Availability</w:t>
       </w:r>
     </w:p>
@@ -37994,7 +37799,18 @@
         <w:jc w:val="both"/>
       </w:pPr>
       <w:r>
-        <w:t>The complete dataset, analysis code, results and this manuscript are openly available at https://github.com/fbivinay/Fiscal-Discipline-and-Investment-Outcomes. The repository contains the audited source series, the 50-row analysis panel used in every estimate reported here, all five analysis scripts, and the full set of tables and figures, so that each result can be reproduced from the raw inputs. It also retains the superseded seven-variable machine-learning run discussed in Section 5.2, so that the leakage diagnosis reported there can be verified rather than taken on trust.</w:t>
+        <w:t xml:space="preserve">The complete dataset, analysis code, results and this manuscript are openly available at </w:t>
+      </w:r>
+      <w:hyperlink r:id="rId33" w:history="1">
+        <w:r>
+          <w:rPr>
+            <w:rStyle w:val="Hyperlink"/>
+          </w:rPr>
+          <w:t>https://github.com/fbivinay/Fiscal-Discipline-and-Investment-Outcomes</w:t>
+        </w:r>
+      </w:hyperlink>
+      <w:r>
+        <w:t xml:space="preserve"> The repository contains the audited source series, the 50-row analysis panel used in every estimate reported here, all five analysis scripts, and the full set of tables and figures, so that each result can be reproduced from the raw inputs. It also retains the superseded seven-variable machine-learning run discussed in Section 5.2, so that the leakage diagnosis reported there can be verified rather than taken on trust.</w:t>
       </w:r>
     </w:p>
     <w:p>
@@ -38016,7 +37832,7 @@
         </w:rPr>
         <w:t xml:space="preserve">Arellano, M., &amp; Bond, S. (1991). Some tests of specification for panel data: Monte Carlo evidence and an application to employment equations. Review of Economic Studies, 58(2), 277-297. </w:t>
       </w:r>
-      <w:hyperlink r:id="rId33" w:history="1">
+      <w:hyperlink r:id="rId34" w:history="1">
         <w:r>
           <w:rPr>
             <w:rStyle w:val="Hyperlink"/>
@@ -38057,7 +37873,7 @@
         </w:rPr>
         <w:t xml:space="preserve">, G. W. (2019). Machine learning methods that economists should know about. Annual Review of Economics, 11, 685-725. </w:t>
       </w:r>
-      <w:hyperlink r:id="rId34" w:history="1">
+      <w:hyperlink r:id="rId35" w:history="1">
         <w:r>
           <w:rPr>
             <w:rStyle w:val="Hyperlink"/>
@@ -38083,6 +37899,7 @@
         <w:rPr>
           <w:sz w:val="21"/>
         </w:rPr>
+        <w:lastRenderedPageBreak/>
         <w:t>Baltagi</w:t>
       </w:r>
       <w:proofErr w:type="spellEnd"/>
@@ -38092,7 +37909,7 @@
         </w:rPr>
         <w:t xml:space="preserve">, B. H. (2021). Econometric analysis of panel data (6th ed.). Springer. </w:t>
       </w:r>
-      <w:hyperlink r:id="rId35" w:history="1">
+      <w:hyperlink r:id="rId36" w:history="1">
         <w:r>
           <w:rPr>
             <w:rStyle w:val="Hyperlink"/>
@@ -38119,7 +37936,7 @@
         </w:rPr>
         <w:t xml:space="preserve">Barro, R. J. (1990). Government spending in a simple model of endogenous growth. Journal of Political Economy, 98(5, Pt. 2), S103-S125. </w:t>
       </w:r>
-      <w:hyperlink r:id="rId36" w:history="1">
+      <w:hyperlink r:id="rId37" w:history="1">
         <w:r>
           <w:rPr>
             <w:rStyle w:val="Hyperlink"/>
@@ -38146,7 +37963,7 @@
         </w:rPr>
         <w:t xml:space="preserve">Blonigen, B. A. (2005). A review of the empirical literature on FDI determinants. Atlantic Economic Journal, 33(4), 383-403. </w:t>
       </w:r>
-      <w:hyperlink r:id="rId37" w:history="1">
+      <w:hyperlink r:id="rId38" w:history="1">
         <w:r>
           <w:rPr>
             <w:rStyle w:val="Hyperlink"/>
@@ -38181,7 +37998,7 @@
         </w:rPr>
         <w:t xml:space="preserve">, E., De Gregorio, J., &amp; Lee, J.-W. (1998). How does foreign direct investment affect economic growth? Journal of International Economics, 45(1), 115-135. </w:t>
       </w:r>
-      <w:hyperlink r:id="rId38" w:history="1">
+      <w:hyperlink r:id="rId39" w:history="1">
         <w:r>
           <w:rPr>
             <w:rStyle w:val="Hyperlink"/>
@@ -38216,7 +38033,7 @@
         </w:rPr>
         <w:t xml:space="preserve">, L. (2001). Random forests. Machine Learning, 45(1), 5-32. </w:t>
       </w:r>
-      <w:hyperlink r:id="rId39" w:history="1">
+      <w:hyperlink r:id="rId40" w:history="1">
         <w:r>
           <w:rPr>
             <w:rStyle w:val="Hyperlink"/>
@@ -38255,7 +38072,7 @@
         </w:rPr>
         <w:t xml:space="preserve">Department for Promotion of Industry and Internal Trade (DPIIT). (2024). State-wise FDI equity inflows (from October 2019). Ministry of Commerce and Industry, Government of India. </w:t>
       </w:r>
-      <w:hyperlink r:id="rId40" w:history="1">
+      <w:hyperlink r:id="rId41" w:history="1">
         <w:r>
           <w:rPr>
             <w:rStyle w:val="Hyperlink"/>
@@ -38282,7 +38099,7 @@
         </w:rPr>
         <w:t xml:space="preserve">Driscoll, J. C., &amp; Kraay, A. C. (1998). Consistent covariance matrix estimation with spatially dependent panel data. Review of Economics and Statistics, 80(4), 549-560. </w:t>
       </w:r>
-      <w:hyperlink r:id="rId41" w:history="1">
+      <w:hyperlink r:id="rId42" w:history="1">
         <w:r>
           <w:rPr>
             <w:rStyle w:val="Hyperlink"/>
@@ -38309,7 +38126,7 @@
         </w:rPr>
         <w:t xml:space="preserve">Drukker, D. M. (2003). Testing for serial correlation in linear panel-data models. Stata Journal, 3(2), 168-177. </w:t>
       </w:r>
-      <w:hyperlink r:id="rId42" w:history="1">
+      <w:hyperlink r:id="rId43" w:history="1">
         <w:r>
           <w:rPr>
             <w:rStyle w:val="Hyperlink"/>
@@ -38336,7 +38153,7 @@
         </w:rPr>
         <w:t xml:space="preserve">Dunning, J. H. (1993). Multinational enterprises and the global economy. Addison-Wesley. </w:t>
       </w:r>
-      <w:hyperlink r:id="rId43" w:history="1">
+      <w:hyperlink r:id="rId44" w:history="1">
         <w:r>
           <w:rPr>
             <w:rStyle w:val="Hyperlink"/>
@@ -38391,7 +38208,7 @@
         </w:rPr>
         <w:t xml:space="preserve">, C. A. (2024). Fiscal federalism and foreign direct investment: An empirical analysis. The World Economy, 47(6), 2287-2331. </w:t>
       </w:r>
-      <w:hyperlink r:id="rId44" w:history="1">
+      <w:hyperlink r:id="rId45" w:history="1">
         <w:r>
           <w:rPr>
             <w:rStyle w:val="Hyperlink"/>
@@ -38418,7 +38235,7 @@
         </w:rPr>
         <w:t xml:space="preserve">Fischer, S. (1993). The role of macroeconomic factors in growth. Journal of Monetary Economics, 32(3), 485-512. </w:t>
       </w:r>
-      <w:hyperlink r:id="rId45" w:history="1">
+      <w:hyperlink r:id="rId46" w:history="1">
         <w:r>
           <w:rPr>
             <w:rStyle w:val="Hyperlink"/>
@@ -38443,10 +38260,9 @@
         <w:rPr>
           <w:sz w:val="21"/>
         </w:rPr>
-        <w:lastRenderedPageBreak/>
         <w:t xml:space="preserve">Government of India. (2025). Report of the Sixteenth Finance Commission, Volume II: Annexures. Ministry of Finance. </w:t>
       </w:r>
-      <w:hyperlink r:id="rId46" w:history="1">
+      <w:hyperlink r:id="rId47" w:history="1">
         <w:r>
           <w:rPr>
             <w:rStyle w:val="Hyperlink"/>
@@ -38487,7 +38303,7 @@
         </w:rPr>
         <w:t xml:space="preserve">, R., &amp; Friedman, J. (2009). The elements of statistical learning: Data mining, inference, and prediction (2nd ed.). Springer. </w:t>
       </w:r>
-      <w:hyperlink r:id="rId47" w:history="1">
+      <w:hyperlink r:id="rId48" w:history="1">
         <w:r>
           <w:rPr>
             <w:rStyle w:val="Hyperlink"/>
@@ -38528,7 +38344,7 @@
         </w:rPr>
         <w:t xml:space="preserve">, 46(6), 1251-1271. </w:t>
       </w:r>
-      <w:hyperlink r:id="rId48" w:history="1">
+      <w:hyperlink r:id="rId49" w:history="1">
         <w:r>
           <w:rPr>
             <w:rStyle w:val="Hyperlink"/>
@@ -38555,7 +38371,7 @@
         </w:rPr>
         <w:t xml:space="preserve">International Monetary Fund. (2020). World economic outlook, April 2020: The great lockdown. IMF. </w:t>
       </w:r>
-      <w:hyperlink r:id="rId49" w:history="1">
+      <w:hyperlink r:id="rId50" w:history="1">
         <w:r>
           <w:rPr>
             <w:rStyle w:val="Hyperlink"/>
@@ -38582,7 +38398,7 @@
         </w:rPr>
         <w:t xml:space="preserve">Lundberg, S. M., &amp; Lee, S.-I. (2017). A unified approach to interpreting model predictions. Advances in Neural Information Processing Systems, 30, 4765-4774. </w:t>
       </w:r>
-      <w:hyperlink r:id="rId50" w:history="1">
+      <w:hyperlink r:id="rId51" w:history="1">
         <w:r>
           <w:rPr>
             <w:rStyle w:val="Hyperlink"/>
@@ -38609,7 +38425,7 @@
         </w:rPr>
         <w:t xml:space="preserve">Mahatekar, D. D. (2025). State-wise foreign direct investment (FDI) flows and economic impacts in India: A comparative study (2019-2024). JETIR, 12(10). </w:t>
       </w:r>
-      <w:hyperlink r:id="rId51" w:history="1">
+      <w:hyperlink r:id="rId52" w:history="1">
         <w:r>
           <w:rPr>
             <w:rStyle w:val="Hyperlink"/>
@@ -38646,6 +38462,7 @@
         <w:rPr>
           <w:sz w:val="21"/>
         </w:rPr>
+        <w:lastRenderedPageBreak/>
         <w:t xml:space="preserve">Ministry of Statistics and </w:t>
       </w:r>
       <w:proofErr w:type="spellStart"/>
@@ -38676,7 +38493,7 @@
         </w:rPr>
         <w:t xml:space="preserve">). (2024). State-wise Gross State Domestic Product, 2011-12 series. Government of India. </w:t>
       </w:r>
-      <w:hyperlink r:id="rId52" w:history="1">
+      <w:hyperlink r:id="rId53" w:history="1">
         <w:r>
           <w:rPr>
             <w:rStyle w:val="Hyperlink"/>
@@ -38703,7 +38520,7 @@
         </w:rPr>
         <w:t xml:space="preserve">Misra, S., Gupta, K., &amp; Trivedi, P. (2021). Sub-national government debt sustainability in India: An empirical analysis. Macroeconomics and Finance in Emerging Market Economies, 16(1), 57-79. </w:t>
       </w:r>
-      <w:hyperlink r:id="rId53" w:history="1">
+      <w:hyperlink r:id="rId54" w:history="1">
         <w:r>
           <w:rPr>
             <w:rStyle w:val="Hyperlink"/>
@@ -38730,7 +38547,7 @@
         </w:rPr>
         <w:t xml:space="preserve">Mullainathan, S., &amp; Spiess, J. (2017). Machine learning: An applied econometric approach. Journal of Economic Perspectives, 31(2), 87-106. </w:t>
       </w:r>
-      <w:hyperlink r:id="rId54" w:history="1">
+      <w:hyperlink r:id="rId55" w:history="1">
         <w:r>
           <w:rPr>
             <w:rStyle w:val="Hyperlink"/>
@@ -38757,7 +38574,7 @@
         </w:rPr>
         <w:t xml:space="preserve">National Institute of Public Finance and Policy (NIPFP). (2024). How much debt is optimal for the major Indian states? Economic growth vs. debt sustainability (Working Paper No. 411). </w:t>
       </w:r>
-      <w:hyperlink r:id="rId55" w:history="1">
+      <w:hyperlink r:id="rId56" w:history="1">
         <w:r>
           <w:rPr>
             <w:rStyle w:val="Hyperlink"/>
@@ -38783,33 +38600,6 @@
           <w:sz w:val="21"/>
         </w:rPr>
         <w:t xml:space="preserve">NITI Aayog. (2025). Fiscal Health Index 2025. Government of India. </w:t>
-      </w:r>
-      <w:hyperlink r:id="rId56" w:history="1">
-        <w:r>
-          <w:rPr>
-            <w:rStyle w:val="Hyperlink"/>
-            <w:sz w:val="21"/>
-          </w:rPr>
-          <w:t>https://niti.gov.in</w:t>
-        </w:r>
-      </w:hyperlink>
-      <w:r>
-        <w:rPr>
-          <w:sz w:val="21"/>
-        </w:rPr>
-        <w:t xml:space="preserve"> </w:t>
-      </w:r>
-    </w:p>
-    <w:p>
-      <w:pPr>
-        <w:spacing w:after="120"/>
-        <w:ind w:left="425" w:hanging="425"/>
-      </w:pPr>
-      <w:r>
-        <w:rPr>
-          <w:sz w:val="21"/>
-        </w:rPr>
-        <w:t xml:space="preserve">NITI Aayog. (2026). Fiscal Health Index 2026. Government of India. </w:t>
       </w:r>
       <w:hyperlink r:id="rId57" w:history="1">
         <w:r>
@@ -38836,9 +38626,36 @@
         <w:rPr>
           <w:sz w:val="21"/>
         </w:rPr>
+        <w:t xml:space="preserve">NITI Aayog. (2026). Fiscal Health Index 2026. Government of India. </w:t>
+      </w:r>
+      <w:hyperlink r:id="rId58" w:history="1">
+        <w:r>
+          <w:rPr>
+            <w:rStyle w:val="Hyperlink"/>
+            <w:sz w:val="21"/>
+          </w:rPr>
+          <w:t>https://niti.gov.in</w:t>
+        </w:r>
+      </w:hyperlink>
+      <w:r>
+        <w:rPr>
+          <w:sz w:val="21"/>
+        </w:rPr>
+        <w:t xml:space="preserve"> </w:t>
+      </w:r>
+    </w:p>
+    <w:p>
+      <w:pPr>
+        <w:spacing w:after="120"/>
+        <w:ind w:left="425" w:hanging="425"/>
+      </w:pPr>
+      <w:r>
+        <w:rPr>
+          <w:sz w:val="21"/>
+        </w:rPr>
         <w:t xml:space="preserve">Oates, W. E. (1972). Fiscal federalism. Harcourt Brace Jovanovich. </w:t>
       </w:r>
-      <w:hyperlink r:id="rId58" w:history="1">
+      <w:hyperlink r:id="rId59" w:history="1">
         <w:r>
           <w:rPr>
             <w:rStyle w:val="Hyperlink"/>
@@ -38865,7 +38682,7 @@
         </w:rPr>
         <w:t xml:space="preserve">O'Brien, R. M. (2007). A caution regarding rules of thumb for variance inflation factors. Quality &amp; Quantity, 41(5), 673-690. </w:t>
       </w:r>
-      <w:hyperlink r:id="rId59" w:history="1">
+      <w:hyperlink r:id="rId60" w:history="1">
         <w:r>
           <w:rPr>
             <w:rStyle w:val="Hyperlink"/>
@@ -38892,7 +38709,7 @@
         </w:rPr>
         <w:t xml:space="preserve">Office of the Registrar General &amp; Census Commissioner, India. (2011). Census of India 2011, primary census abstract. Ministry of Home Affairs, Government of India. </w:t>
       </w:r>
-      <w:hyperlink r:id="rId60" w:history="1">
+      <w:hyperlink r:id="rId61" w:history="1">
         <w:r>
           <w:rPr>
             <w:rStyle w:val="Hyperlink"/>
@@ -38919,7 +38736,7 @@
         </w:rPr>
         <w:t xml:space="preserve">Panda, M., &amp; Sahay, S. (2022). Determinants of economic growth across states in India. In S. R. Hashim, R. Mukherji, &amp; B. Mishra (Eds.), Perspectives on inclusive policies for development in India (pp. 133-152). Springer. </w:t>
       </w:r>
-      <w:hyperlink r:id="rId61" w:history="1">
+      <w:hyperlink r:id="rId62" w:history="1">
         <w:r>
           <w:rPr>
             <w:rStyle w:val="Hyperlink"/>
@@ -38954,7 +38771,7 @@
         </w:rPr>
         <w:t xml:space="preserve">, M. H. (2015). Testing weak cross-sectional dependence in large panels. Econometric Reviews, 34(6-10), 1089-1117. </w:t>
       </w:r>
-      <w:hyperlink r:id="rId62" w:history="1">
+      <w:hyperlink r:id="rId63" w:history="1">
         <w:r>
           <w:rPr>
             <w:rStyle w:val="Hyperlink"/>
@@ -38981,7 +38798,7 @@
         </w:rPr>
         <w:t xml:space="preserve">Rao, M. G., &amp; Singh, N. (2005). The political economy of federalism in India. Oxford University Press. </w:t>
       </w:r>
-      <w:hyperlink r:id="rId63" w:history="1">
+      <w:hyperlink r:id="rId64" w:history="1">
         <w:r>
           <w:rPr>
             <w:rStyle w:val="Hyperlink"/>
@@ -39008,7 +38825,7 @@
         </w:rPr>
         <w:t xml:space="preserve">Reserve Bank of India. (2024). State finances: A study of budgets, 2023-24. RBI. </w:t>
       </w:r>
-      <w:hyperlink r:id="rId64" w:history="1">
+      <w:hyperlink r:id="rId65" w:history="1">
         <w:r>
           <w:rPr>
             <w:rStyle w:val="Hyperlink"/>
@@ -39033,10 +38850,9 @@
         <w:rPr>
           <w:sz w:val="21"/>
         </w:rPr>
-        <w:lastRenderedPageBreak/>
         <w:t xml:space="preserve">Roodman, D. (2009). How to do xtabond2: An introduction to difference and system GMM in Stata. Stata Journal, 9(1), 86-136. </w:t>
       </w:r>
-      <w:hyperlink r:id="rId65" w:history="1">
+      <w:hyperlink r:id="rId66" w:history="1">
         <w:r>
           <w:rPr>
             <w:rStyle w:val="Hyperlink"/>
@@ -39063,7 +38879,7 @@
         </w:rPr>
         <w:t xml:space="preserve">Spearman, C. (1904). The proof and measurement of association between two things. American Journal of Psychology, 15(1), 72-101. </w:t>
       </w:r>
-      <w:hyperlink r:id="rId66" w:history="1">
+      <w:hyperlink r:id="rId67" w:history="1">
         <w:r>
           <w:rPr>
             <w:rStyle w:val="Hyperlink"/>
@@ -39098,7 +38914,7 @@
         </w:rPr>
         <w:t xml:space="preserve">, R. (1996). Regression shrinkage and selection via the lasso. Journal of the Royal Statistical Society, Series B, 58(1), 267-288. </w:t>
       </w:r>
-      <w:hyperlink r:id="rId67" w:history="1">
+      <w:hyperlink r:id="rId68" w:history="1">
         <w:r>
           <w:rPr>
             <w:rStyle w:val="Hyperlink"/>
@@ -39125,7 +38941,7 @@
         </w:rPr>
         <w:t xml:space="preserve">Tiebout, C. M. (1956). A pure theory of local expenditures. Journal of Political Economy, 64(5), 416-424. </w:t>
       </w:r>
-      <w:hyperlink r:id="rId68" w:history="1">
+      <w:hyperlink r:id="rId69" w:history="1">
         <w:r>
           <w:rPr>
             <w:rStyle w:val="Hyperlink"/>
@@ -39166,7 +38982,7 @@
         </w:rPr>
         <w:t xml:space="preserve">. (2011). Growth effects of fiscal policy of Indian states. Millennial Asia, 2(2), 141-162. </w:t>
       </w:r>
-      <w:hyperlink r:id="rId69" w:history="1">
+      <w:hyperlink r:id="rId70" w:history="1">
         <w:r>
           <w:rPr>
             <w:rStyle w:val="Hyperlink"/>
@@ -39193,7 +39009,7 @@
         </w:rPr>
         <w:t xml:space="preserve">Varian, H. R. (2014). Big data: New tricks for econometrics. Journal of Economic Perspectives, 28(2), 3-28. </w:t>
       </w:r>
-      <w:hyperlink r:id="rId70" w:history="1">
+      <w:hyperlink r:id="rId71" w:history="1">
         <w:r>
           <w:rPr>
             <w:rStyle w:val="Hyperlink"/>
@@ -39220,7 +39036,7 @@
         </w:rPr>
         <w:t xml:space="preserve">Wooldridge, J. M. (2010). Econometric analysis of cross section and panel data (2nd ed.). MIT Press. </w:t>
       </w:r>
-      <w:hyperlink r:id="rId71" w:history="1">
+      <w:hyperlink r:id="rId72" w:history="1">
         <w:r>
           <w:rPr>
             <w:rStyle w:val="Hyperlink"/>
@@ -39248,9 +39064,10 @@
         <w:rPr>
           <w:sz w:val="21"/>
         </w:rPr>
+        <w:lastRenderedPageBreak/>
         <w:t xml:space="preserve">Zou, H., &amp; Hastie, T. (2005). Regularization and variable selection via the elastic net. Journal of the Royal Statistical Society, Series B, 67(2), 301-320. </w:t>
       </w:r>
-      <w:hyperlink r:id="rId72" w:history="1">
+      <w:hyperlink r:id="rId73" w:history="1">
         <w:r>
           <w:rPr>
             <w:rStyle w:val="Hyperlink"/>

</xml_diff>